<commit_message>
Updated FDD as of 4/15/2026
</commit_message>
<xml_diff>
--- a/Documents/FDD RPA - RFL Reconciliation.docx
+++ b/Documents/FDD RPA - RFL Reconciliation.docx
@@ -580,7 +580,7 @@
           <w:sz w:val="24"/>
           <w:szCs w:val="24"/>
         </w:rPr>
-        <w:t>2</w:t>
+        <w:t>5</w:t>
       </w:r>
     </w:p>
     <w:p>
@@ -1217,7 +1217,7 @@
               <w:rPr>
                 <w:rFonts w:ascii="Book Antiqua" w:hAnsi="Book Antiqua"/>
               </w:rPr>
-              <w:t>04/13/2026</w:t>
+              <w:t>02/15/2026</w:t>
             </w:r>
           </w:p>
         </w:tc>
@@ -1275,19 +1275,13 @@
               <w:rPr>
                 <w:rFonts w:ascii="Book Antiqua" w:hAnsi="Book Antiqua"/>
               </w:rPr>
-              <w:t xml:space="preserve">FDD updates based on CR </w:t>
+              <w:t xml:space="preserve">FDD update based on UCP-184825. </w:t>
             </w:r>
             <w:r>
               <w:rPr>
                 <w:rFonts w:ascii="Book Antiqua" w:hAnsi="Book Antiqua"/>
               </w:rPr>
-              <w:t>UCP-188100</w:t>
-            </w:r>
-            <w:r>
-              <w:rPr>
-                <w:rFonts w:ascii="Book Antiqua" w:hAnsi="Book Antiqua"/>
-              </w:rPr>
-              <w:t>. Added Technical Change Note section</w:t>
+              <w:t>Added Technical Change Note section</w:t>
             </w:r>
           </w:p>
         </w:tc>
@@ -1307,6 +1301,12 @@
                 <w:rFonts w:ascii="Book Antiqua" w:hAnsi="Book Antiqua"/>
               </w:rPr>
             </w:pPr>
+            <w:r>
+              <w:rPr>
+                <w:rFonts w:ascii="Book Antiqua" w:hAnsi="Book Antiqua"/>
+              </w:rPr>
+              <w:t>04/13/2026</w:t>
+            </w:r>
           </w:p>
         </w:tc>
         <w:tc>
@@ -1321,6 +1321,13 @@
                 <w:color w:val="auto"/>
               </w:rPr>
             </w:pPr>
+            <w:r>
+              <w:rPr>
+                <w:rStyle w:val="HighlightedVariable"/>
+                <w:color w:val="auto"/>
+              </w:rPr>
+              <w:t>Ari Widjaja</w:t>
+            </w:r>
           </w:p>
         </w:tc>
         <w:tc>
@@ -1333,6 +1340,18 @@
                 <w:rFonts w:ascii="Book Antiqua" w:hAnsi="Book Antiqua"/>
               </w:rPr>
             </w:pPr>
+            <w:r>
+              <w:rPr>
+                <w:rFonts w:ascii="Book Antiqua" w:hAnsi="Book Antiqua"/>
+              </w:rPr>
+              <w:t>1.</w:t>
+            </w:r>
+            <w:r>
+              <w:rPr>
+                <w:rFonts w:ascii="Book Antiqua" w:hAnsi="Book Antiqua"/>
+              </w:rPr>
+              <w:t>4</w:t>
+            </w:r>
           </w:p>
         </w:tc>
         <w:tc>
@@ -1346,6 +1365,124 @@
                 <w:rFonts w:ascii="Book Antiqua" w:hAnsi="Book Antiqua"/>
               </w:rPr>
             </w:pPr>
+            <w:r>
+              <w:rPr>
+                <w:rFonts w:ascii="Book Antiqua" w:hAnsi="Book Antiqua"/>
+              </w:rPr>
+              <w:t xml:space="preserve">FDD updates based on CR </w:t>
+            </w:r>
+            <w:r>
+              <w:rPr>
+                <w:rFonts w:ascii="Book Antiqua" w:hAnsi="Book Antiqua"/>
+              </w:rPr>
+              <w:t>UCP-188100</w:t>
+            </w:r>
+            <w:r>
+              <w:rPr>
+                <w:rFonts w:ascii="Book Antiqua" w:hAnsi="Book Antiqua"/>
+              </w:rPr>
+              <w:t xml:space="preserve">. </w:t>
+            </w:r>
+            <w:r>
+              <w:rPr>
+                <w:rFonts w:ascii="Book Antiqua" w:hAnsi="Book Antiqua"/>
+              </w:rPr>
+              <w:t>Updated</w:t>
+            </w:r>
+            <w:r>
+              <w:rPr>
+                <w:rFonts w:ascii="Book Antiqua" w:hAnsi="Book Antiqua"/>
+              </w:rPr>
+              <w:t xml:space="preserve"> Technical Change Note section</w:t>
+            </w:r>
+          </w:p>
+        </w:tc>
+      </w:tr>
+      <w:tr>
+        <w:trPr>
+          <w:cantSplit/>
+        </w:trPr>
+        <w:tc>
+          <w:tcPr>
+            <w:tcW w:w="1086" w:type="dxa"/>
+          </w:tcPr>
+          <w:p>
+            <w:pPr>
+              <w:pStyle w:val="TableText"/>
+              <w:rPr>
+                <w:rFonts w:ascii="Book Antiqua" w:hAnsi="Book Antiqua"/>
+              </w:rPr>
+            </w:pPr>
+            <w:r>
+              <w:rPr>
+                <w:rFonts w:ascii="Book Antiqua" w:hAnsi="Book Antiqua"/>
+              </w:rPr>
+              <w:t>04/15/2026</w:t>
+            </w:r>
+          </w:p>
+        </w:tc>
+        <w:tc>
+          <w:tcPr>
+            <w:tcW w:w="1890" w:type="dxa"/>
+          </w:tcPr>
+          <w:p>
+            <w:pPr>
+              <w:pStyle w:val="TableText"/>
+              <w:rPr>
+                <w:rStyle w:val="HighlightedVariable"/>
+                <w:color w:val="auto"/>
+              </w:rPr>
+            </w:pPr>
+            <w:r>
+              <w:rPr>
+                <w:rStyle w:val="HighlightedVariable"/>
+                <w:color w:val="auto"/>
+              </w:rPr>
+              <w:t>Ari Widjaja</w:t>
+            </w:r>
+          </w:p>
+        </w:tc>
+        <w:tc>
+          <w:tcPr>
+            <w:tcW w:w="810" w:type="dxa"/>
+          </w:tcPr>
+          <w:p>
+            <w:pPr>
+              <w:rPr>
+                <w:rFonts w:ascii="Book Antiqua" w:hAnsi="Book Antiqua"/>
+              </w:rPr>
+            </w:pPr>
+            <w:r>
+              <w:rPr>
+                <w:rFonts w:ascii="Book Antiqua" w:hAnsi="Book Antiqua"/>
+              </w:rPr>
+              <w:t>1.</w:t>
+            </w:r>
+            <w:r>
+              <w:rPr>
+                <w:rFonts w:ascii="Book Antiqua" w:hAnsi="Book Antiqua"/>
+              </w:rPr>
+              <w:t>5</w:t>
+            </w:r>
+          </w:p>
+        </w:tc>
+        <w:tc>
+          <w:tcPr>
+            <w:tcW w:w="3966" w:type="dxa"/>
+          </w:tcPr>
+          <w:p>
+            <w:pPr>
+              <w:pStyle w:val="TableText"/>
+              <w:rPr>
+                <w:rFonts w:ascii="Book Antiqua" w:hAnsi="Book Antiqua"/>
+              </w:rPr>
+            </w:pPr>
+            <w:r>
+              <w:rPr>
+                <w:rFonts w:ascii="Book Antiqua" w:hAnsi="Book Antiqua"/>
+              </w:rPr>
+              <w:t>Added changes per UCP-188507 on Technical Change Note section</w:t>
+            </w:r>
           </w:p>
         </w:tc>
       </w:tr>
@@ -15132,25 +15269,7 @@
           <w:sz w:val="22"/>
           <w:szCs w:val="22"/>
         </w:rPr>
-        <w:t xml:space="preserve"> Peoplesoft and </w:t>
-      </w:r>
-      <w:proofErr w:type="gramStart"/>
-      <w:r>
-        <w:rPr>
-          <w:rFonts w:ascii="Book Antiqua" w:hAnsi="Book Antiqua"/>
-          <w:sz w:val="22"/>
-          <w:szCs w:val="22"/>
-        </w:rPr>
-        <w:t>navigate</w:t>
-      </w:r>
-      <w:proofErr w:type="gramEnd"/>
-      <w:r>
-        <w:rPr>
-          <w:rFonts w:ascii="Book Antiqua" w:hAnsi="Book Antiqua"/>
-          <w:sz w:val="22"/>
-          <w:szCs w:val="22"/>
-        </w:rPr>
-        <w:t xml:space="preserve"> to Job Data page. Once login is established and </w:t>
+        <w:t xml:space="preserve"> Peoplesoft and navigate to Job Data page. Once login is established and </w:t>
       </w:r>
       <w:proofErr w:type="gramStart"/>
       <w:r>
@@ -15553,25 +15672,7 @@
           <w:sz w:val="22"/>
           <w:szCs w:val="22"/>
         </w:rPr>
-        <w:t xml:space="preserve">ith Job Indicator equals Primary Job, regardless of Payroll Status will advance to the next processing. Therefore the </w:t>
-      </w:r>
-      <w:proofErr w:type="gramStart"/>
-      <w:r>
-        <w:rPr>
-          <w:rFonts w:ascii="Book Antiqua" w:hAnsi="Book Antiqua"/>
-          <w:sz w:val="22"/>
-          <w:szCs w:val="22"/>
-        </w:rPr>
-        <w:t>rules</w:t>
-      </w:r>
-      <w:proofErr w:type="gramEnd"/>
-      <w:r>
-        <w:rPr>
-          <w:rFonts w:ascii="Book Antiqua" w:hAnsi="Book Antiqua"/>
-          <w:sz w:val="22"/>
-          <w:szCs w:val="22"/>
-        </w:rPr>
-        <w:t xml:space="preserve"> for exception </w:t>
+        <w:t xml:space="preserve">ith Job Indicator equals Primary Job, regardless of Payroll Status will advance to the next processing. Therefore the rules for exception </w:t>
       </w:r>
       <w:proofErr w:type="gramStart"/>
       <w:r>
@@ -17393,6 +17494,184 @@
       <w:r>
         <w:rPr>
           <w:rFonts w:ascii="Book Antiqua" w:hAnsi="Book Antiqua"/>
+          <w:b/>
+          <w:bCs/>
+          <w:sz w:val="22"/>
+          <w:szCs w:val="22"/>
+          <w:u w:val="single"/>
+        </w:rPr>
+        <w:t xml:space="preserve">Change note as of </w:t>
+      </w:r>
+      <w:r>
+        <w:rPr>
+          <w:rFonts w:ascii="Book Antiqua" w:hAnsi="Book Antiqua"/>
+          <w:b/>
+          <w:bCs/>
+          <w:sz w:val="22"/>
+          <w:szCs w:val="22"/>
+          <w:u w:val="single"/>
+        </w:rPr>
+        <w:t>2</w:t>
+      </w:r>
+      <w:r>
+        <w:rPr>
+          <w:rFonts w:ascii="Book Antiqua" w:hAnsi="Book Antiqua"/>
+          <w:b/>
+          <w:bCs/>
+          <w:sz w:val="22"/>
+          <w:szCs w:val="22"/>
+          <w:u w:val="single"/>
+        </w:rPr>
+        <w:t>/</w:t>
+      </w:r>
+      <w:r>
+        <w:rPr>
+          <w:rFonts w:ascii="Book Antiqua" w:hAnsi="Book Antiqua"/>
+          <w:b/>
+          <w:bCs/>
+          <w:sz w:val="22"/>
+          <w:szCs w:val="22"/>
+          <w:u w:val="single"/>
+        </w:rPr>
+        <w:t>19</w:t>
+      </w:r>
+      <w:r>
+        <w:rPr>
+          <w:rFonts w:ascii="Book Antiqua" w:hAnsi="Book Antiqua"/>
+          <w:b/>
+          <w:bCs/>
+          <w:sz w:val="22"/>
+          <w:szCs w:val="22"/>
+          <w:u w:val="single"/>
+        </w:rPr>
+        <w:t>/2026</w:t>
+      </w:r>
+      <w:r>
+        <w:rPr>
+          <w:rFonts w:ascii="Book Antiqua" w:hAnsi="Book Antiqua"/>
+          <w:b/>
+          <w:bCs/>
+          <w:sz w:val="22"/>
+          <w:szCs w:val="22"/>
+          <w:u w:val="single"/>
+        </w:rPr>
+        <w:t xml:space="preserve"> (based on</w:t>
+      </w:r>
+      <w:r>
+        <w:rPr>
+          <w:rFonts w:ascii="Book Antiqua" w:hAnsi="Book Antiqua"/>
+          <w:b/>
+          <w:bCs/>
+          <w:sz w:val="22"/>
+          <w:szCs w:val="22"/>
+          <w:u w:val="single"/>
+        </w:rPr>
+        <w:t xml:space="preserve"> </w:t>
+      </w:r>
+      <w:r>
+        <w:rPr>
+          <w:rFonts w:ascii="Book Antiqua" w:hAnsi="Book Antiqua"/>
+          <w:b/>
+          <w:bCs/>
+          <w:sz w:val="22"/>
+          <w:szCs w:val="22"/>
+          <w:u w:val="single"/>
+        </w:rPr>
+        <w:t>UCP-184825</w:t>
+      </w:r>
+      <w:proofErr w:type="gramStart"/>
+      <w:r>
+        <w:rPr>
+          <w:rFonts w:ascii="Book Antiqua" w:hAnsi="Book Antiqua"/>
+          <w:b/>
+          <w:bCs/>
+          <w:sz w:val="22"/>
+          <w:szCs w:val="22"/>
+          <w:u w:val="single"/>
+        </w:rPr>
+        <w:t>)</w:t>
+      </w:r>
+      <w:r>
+        <w:rPr>
+          <w:rFonts w:ascii="Book Antiqua" w:hAnsi="Book Antiqua"/>
+          <w:sz w:val="22"/>
+          <w:szCs w:val="22"/>
+        </w:rPr>
+        <w:t xml:space="preserve">  :</w:t>
+      </w:r>
+      <w:proofErr w:type="gramEnd"/>
+      <w:r>
+        <w:rPr>
+          <w:rFonts w:ascii="Book Antiqua" w:hAnsi="Book Antiqua"/>
+          <w:sz w:val="22"/>
+          <w:szCs w:val="22"/>
+        </w:rPr>
+        <w:t xml:space="preserve"> </w:t>
+      </w:r>
+      <w:r>
+        <w:rPr>
+          <w:rFonts w:ascii="Book Antiqua" w:hAnsi="Book Antiqua"/>
+          <w:sz w:val="22"/>
+          <w:szCs w:val="22"/>
+        </w:rPr>
+        <w:t>Label update on scenario where within FIN001 1) the employee does not have a record of having any in-scope plan -or- 2) there is no missed paycheck dates identified. The label for scenario 1 is “</w:t>
+      </w:r>
+      <w:r>
+        <w:rPr>
+          <w:rFonts w:ascii="Book Antiqua" w:hAnsi="Book Antiqua"/>
+          <w:sz w:val="22"/>
+          <w:szCs w:val="22"/>
+        </w:rPr>
+        <w:t>No In-Scope Plan Type</w:t>
+      </w:r>
+      <w:r>
+        <w:rPr>
+          <w:rFonts w:ascii="Book Antiqua" w:hAnsi="Book Antiqua"/>
+          <w:sz w:val="22"/>
+          <w:szCs w:val="22"/>
+        </w:rPr>
+        <w:t>”; the label for scenario 2 is “No Missed Paycheck Date”</w:t>
+      </w:r>
+    </w:p>
+    <w:p>
+      <w:pPr>
+        <w:pStyle w:val="Header"/>
+        <w:ind w:left="540" w:hanging="180"/>
+        <w:rPr>
+          <w:rFonts w:ascii="Book Antiqua" w:hAnsi="Book Antiqua"/>
+          <w:b/>
+          <w:bCs/>
+          <w:sz w:val="24"/>
+          <w:szCs w:val="24"/>
+        </w:rPr>
+      </w:pPr>
+    </w:p>
+    <w:p>
+      <w:pPr>
+        <w:pStyle w:val="Header"/>
+        <w:ind w:left="540" w:hanging="180"/>
+        <w:rPr>
+          <w:rFonts w:ascii="Book Antiqua" w:hAnsi="Book Antiqua"/>
+          <w:b/>
+          <w:bCs/>
+          <w:sz w:val="24"/>
+          <w:szCs w:val="24"/>
+        </w:rPr>
+      </w:pPr>
+    </w:p>
+    <w:p>
+      <w:pPr>
+        <w:pStyle w:val="Header"/>
+        <w:ind w:left="360"/>
+        <w:rPr>
+          <w:rFonts w:ascii="Book Antiqua" w:hAnsi="Book Antiqua"/>
+          <w:sz w:val="22"/>
+          <w:szCs w:val="22"/>
+        </w:rPr>
+      </w:pPr>
+      <w:r>
+        <w:rPr>
+          <w:rFonts w:ascii="Book Antiqua" w:hAnsi="Book Antiqua"/>
           <w:sz w:val="22"/>
           <w:szCs w:val="22"/>
         </w:rPr>
@@ -19520,7 +19799,3138 @@
     <w:p>
       <w:pPr>
         <w:pStyle w:val="Header"/>
-        <w:ind w:left="540" w:hanging="180"/>
+        <w:numPr>
+          <w:ilvl w:val="3"/>
+          <w:numId w:val="42"/>
+        </w:numPr>
+        <w:ind w:left="900"/>
+        <w:rPr>
+          <w:rFonts w:ascii="Book Antiqua" w:hAnsi="Book Antiqua"/>
+          <w:sz w:val="24"/>
+          <w:szCs w:val="24"/>
+        </w:rPr>
+      </w:pPr>
+      <w:r>
+        <w:rPr>
+          <w:rFonts w:ascii="Book Antiqua" w:hAnsi="Book Antiqua"/>
+          <w:sz w:val="24"/>
+          <w:szCs w:val="24"/>
+        </w:rPr>
+        <w:t xml:space="preserve">Changes per </w:t>
+      </w:r>
+      <w:hyperlink r:id="rId57" w:history="1">
+        <w:r>
+          <w:rPr>
+            <w:rStyle w:val="Hyperlink"/>
+            <w:rFonts w:ascii="Book Antiqua" w:hAnsi="Book Antiqua"/>
+            <w:sz w:val="24"/>
+            <w:szCs w:val="24"/>
+          </w:rPr>
+          <w:t>UCP-184825</w:t>
+        </w:r>
+      </w:hyperlink>
+    </w:p>
+    <w:tbl>
+      <w:tblPr>
+        <w:tblStyle w:val="TableGrid"/>
+        <w:tblW w:w="0" w:type="auto"/>
+        <w:tblInd w:w="180" w:type="dxa"/>
+        <w:tblLook w:val="04A0" w:firstRow="1" w:lastRow="0" w:firstColumn="1" w:lastColumn="0" w:noHBand="0" w:noVBand="1"/>
+      </w:tblPr>
+      <w:tblGrid>
+        <w:gridCol w:w="618"/>
+        <w:gridCol w:w="1896"/>
+        <w:gridCol w:w="4082"/>
+        <w:gridCol w:w="2574"/>
+      </w:tblGrid>
+      <w:tr>
+        <w:tc>
+          <w:tcPr>
+            <w:tcW w:w="618" w:type="dxa"/>
+          </w:tcPr>
+          <w:p>
+            <w:pPr>
+              <w:pStyle w:val="Header"/>
+              <w:rPr>
+                <w:rFonts w:ascii="Book Antiqua" w:hAnsi="Book Antiqua"/>
+                <w:sz w:val="20"/>
+                <w:szCs w:val="20"/>
+              </w:rPr>
+            </w:pPr>
+            <w:r>
+              <w:rPr>
+                <w:rFonts w:ascii="Book Antiqua" w:hAnsi="Book Antiqua"/>
+                <w:sz w:val="20"/>
+                <w:szCs w:val="20"/>
+              </w:rPr>
+              <w:t>No</w:t>
+            </w:r>
+          </w:p>
+        </w:tc>
+        <w:tc>
+          <w:tcPr>
+            <w:tcW w:w="1896" w:type="dxa"/>
+          </w:tcPr>
+          <w:p>
+            <w:pPr>
+              <w:pStyle w:val="Header"/>
+              <w:rPr>
+                <w:rFonts w:ascii="Book Antiqua" w:hAnsi="Book Antiqua"/>
+                <w:sz w:val="20"/>
+                <w:szCs w:val="20"/>
+              </w:rPr>
+            </w:pPr>
+            <w:r>
+              <w:rPr>
+                <w:rFonts w:ascii="Book Antiqua" w:hAnsi="Book Antiqua"/>
+                <w:sz w:val="20"/>
+                <w:szCs w:val="20"/>
+              </w:rPr>
+              <w:t>Item</w:t>
+            </w:r>
+          </w:p>
+        </w:tc>
+        <w:tc>
+          <w:tcPr>
+            <w:tcW w:w="4082" w:type="dxa"/>
+          </w:tcPr>
+          <w:p>
+            <w:pPr>
+              <w:pStyle w:val="Header"/>
+              <w:rPr>
+                <w:rFonts w:ascii="Book Antiqua" w:hAnsi="Book Antiqua"/>
+                <w:sz w:val="20"/>
+                <w:szCs w:val="20"/>
+              </w:rPr>
+            </w:pPr>
+            <w:r>
+              <w:rPr>
+                <w:rFonts w:ascii="Book Antiqua" w:hAnsi="Book Antiqua"/>
+                <w:sz w:val="20"/>
+                <w:szCs w:val="20"/>
+              </w:rPr>
+              <w:t>Change Description</w:t>
+            </w:r>
+          </w:p>
+        </w:tc>
+        <w:tc>
+          <w:tcPr>
+            <w:tcW w:w="2574" w:type="dxa"/>
+          </w:tcPr>
+          <w:p>
+            <w:pPr>
+              <w:pStyle w:val="Header"/>
+              <w:rPr>
+                <w:rFonts w:ascii="Book Antiqua" w:hAnsi="Book Antiqua"/>
+                <w:sz w:val="20"/>
+                <w:szCs w:val="20"/>
+              </w:rPr>
+            </w:pPr>
+            <w:r>
+              <w:rPr>
+                <w:rFonts w:ascii="Book Antiqua" w:hAnsi="Book Antiqua"/>
+                <w:sz w:val="20"/>
+                <w:szCs w:val="20"/>
+              </w:rPr>
+              <w:t>Reason/Justification</w:t>
+            </w:r>
+          </w:p>
+        </w:tc>
+      </w:tr>
+      <w:tr>
+        <w:tc>
+          <w:tcPr>
+            <w:tcW w:w="618" w:type="dxa"/>
+          </w:tcPr>
+          <w:p>
+            <w:pPr>
+              <w:pStyle w:val="Header"/>
+              <w:rPr>
+                <w:rFonts w:ascii="Book Antiqua" w:hAnsi="Book Antiqua"/>
+                <w:sz w:val="20"/>
+                <w:szCs w:val="20"/>
+              </w:rPr>
+            </w:pPr>
+            <w:r>
+              <w:rPr>
+                <w:rFonts w:ascii="Book Antiqua" w:hAnsi="Book Antiqua"/>
+                <w:sz w:val="20"/>
+                <w:szCs w:val="20"/>
+              </w:rPr>
+              <w:t>1.0</w:t>
+            </w:r>
+          </w:p>
+        </w:tc>
+        <w:tc>
+          <w:tcPr>
+            <w:tcW w:w="1896" w:type="dxa"/>
+          </w:tcPr>
+          <w:p>
+            <w:pPr>
+              <w:pStyle w:val="Header"/>
+              <w:rPr>
+                <w:rFonts w:ascii="Book Antiqua" w:hAnsi="Book Antiqua"/>
+                <w:sz w:val="20"/>
+                <w:szCs w:val="20"/>
+              </w:rPr>
+            </w:pPr>
+            <w:r>
+              <w:rPr>
+                <w:rFonts w:ascii="Book Antiqua" w:hAnsi="Book Antiqua"/>
+                <w:sz w:val="20"/>
+                <w:szCs w:val="20"/>
+              </w:rPr>
+              <w:t>ReturnFromLeave-FinalReport.py</w:t>
+            </w:r>
+          </w:p>
+        </w:tc>
+        <w:tc>
+          <w:tcPr>
+            <w:tcW w:w="4082" w:type="dxa"/>
+          </w:tcPr>
+          <w:p>
+            <w:pPr>
+              <w:pStyle w:val="Header"/>
+              <w:rPr>
+                <w:rFonts w:ascii="Book Antiqua" w:hAnsi="Book Antiqua"/>
+                <w:sz w:val="20"/>
+                <w:szCs w:val="20"/>
+              </w:rPr>
+            </w:pPr>
+            <w:r>
+              <w:rPr>
+                <w:rFonts w:ascii="Book Antiqua" w:hAnsi="Book Antiqua"/>
+                <w:sz w:val="20"/>
+                <w:szCs w:val="20"/>
+              </w:rPr>
+              <w:t xml:space="preserve">Line 262:        </w:t>
+            </w:r>
+          </w:p>
+          <w:p>
+            <w:pPr>
+              <w:pStyle w:val="Header"/>
+              <w:rPr>
+                <w:rFonts w:ascii="Book Antiqua" w:hAnsi="Book Antiqua"/>
+                <w:sz w:val="20"/>
+                <w:szCs w:val="20"/>
+              </w:rPr>
+            </w:pPr>
+          </w:p>
+          <w:p>
+            <w:pPr>
+              <w:pStyle w:val="Header"/>
+              <w:rPr>
+                <w:rFonts w:ascii="Book Antiqua" w:hAnsi="Book Antiqua"/>
+                <w:sz w:val="20"/>
+                <w:szCs w:val="20"/>
+              </w:rPr>
+            </w:pPr>
+            <w:r>
+              <w:rPr>
+                <w:rFonts w:ascii="Book Antiqua" w:hAnsi="Book Antiqua"/>
+                <w:sz w:val="20"/>
+                <w:szCs w:val="20"/>
+              </w:rPr>
+              <w:t xml:space="preserve"># as of 02/3/2026, this line is moved up. </w:t>
+            </w:r>
+            <w:proofErr w:type="spellStart"/>
+            <w:r>
+              <w:rPr>
+                <w:rFonts w:ascii="Book Antiqua" w:hAnsi="Book Antiqua"/>
+                <w:sz w:val="20"/>
+                <w:szCs w:val="20"/>
+              </w:rPr>
+              <w:t>dfOrigin</w:t>
+            </w:r>
+            <w:proofErr w:type="spellEnd"/>
+            <w:r>
+              <w:rPr>
+                <w:rFonts w:ascii="Book Antiqua" w:hAnsi="Book Antiqua"/>
+                <w:sz w:val="20"/>
+                <w:szCs w:val="20"/>
+              </w:rPr>
+              <w:t xml:space="preserve"> is the original </w:t>
+            </w:r>
+            <w:proofErr w:type="spellStart"/>
+            <w:r>
+              <w:rPr>
+                <w:rFonts w:ascii="Book Antiqua" w:hAnsi="Book Antiqua"/>
+                <w:sz w:val="20"/>
+                <w:szCs w:val="20"/>
+              </w:rPr>
+              <w:t>dataframe</w:t>
+            </w:r>
+            <w:proofErr w:type="spellEnd"/>
+          </w:p>
+          <w:p>
+            <w:pPr>
+              <w:pStyle w:val="Header"/>
+              <w:rPr>
+                <w:rFonts w:ascii="Book Antiqua" w:hAnsi="Book Antiqua"/>
+                <w:sz w:val="20"/>
+                <w:szCs w:val="20"/>
+              </w:rPr>
+            </w:pPr>
+          </w:p>
+          <w:p>
+            <w:pPr>
+              <w:pStyle w:val="Header"/>
+              <w:rPr>
+                <w:rFonts w:ascii="Book Antiqua" w:hAnsi="Book Antiqua"/>
+                <w:sz w:val="20"/>
+                <w:szCs w:val="20"/>
+              </w:rPr>
+            </w:pPr>
+            <w:proofErr w:type="spellStart"/>
+            <w:r>
+              <w:rPr>
+                <w:rFonts w:ascii="Book Antiqua" w:hAnsi="Book Antiqua"/>
+                <w:sz w:val="20"/>
+                <w:szCs w:val="20"/>
+              </w:rPr>
+              <w:t>dfOrigin</w:t>
+            </w:r>
+            <w:proofErr w:type="spellEnd"/>
+            <w:r>
+              <w:rPr>
+                <w:rFonts w:ascii="Book Antiqua" w:hAnsi="Book Antiqua"/>
+                <w:sz w:val="20"/>
+                <w:szCs w:val="20"/>
+              </w:rPr>
+              <w:t xml:space="preserve"> = </w:t>
+            </w:r>
+            <w:proofErr w:type="spellStart"/>
+            <w:r>
+              <w:rPr>
+                <w:rFonts w:ascii="Book Antiqua" w:hAnsi="Book Antiqua"/>
+                <w:sz w:val="20"/>
+                <w:szCs w:val="20"/>
+              </w:rPr>
+              <w:t>df</w:t>
+            </w:r>
+            <w:proofErr w:type="spellEnd"/>
+          </w:p>
+          <w:p>
+            <w:pPr>
+              <w:pStyle w:val="Header"/>
+              <w:rPr>
+                <w:rFonts w:ascii="Book Antiqua" w:hAnsi="Book Antiqua"/>
+                <w:sz w:val="20"/>
+                <w:szCs w:val="20"/>
+              </w:rPr>
+            </w:pPr>
+          </w:p>
+          <w:p>
+            <w:pPr>
+              <w:pStyle w:val="Header"/>
+              <w:rPr>
+                <w:rFonts w:ascii="Book Antiqua" w:hAnsi="Book Antiqua"/>
+                <w:sz w:val="20"/>
+                <w:szCs w:val="20"/>
+              </w:rPr>
+            </w:pPr>
+            <w:r>
+              <w:rPr>
+                <w:rFonts w:ascii="Book Antiqua" w:hAnsi="Book Antiqua"/>
+                <w:sz w:val="20"/>
+                <w:szCs w:val="20"/>
+              </w:rPr>
+              <w:t>Line 264:</w:t>
+            </w:r>
+          </w:p>
+          <w:p>
+            <w:pPr>
+              <w:pStyle w:val="Header"/>
+              <w:rPr>
+                <w:rFonts w:ascii="Book Antiqua" w:hAnsi="Book Antiqua"/>
+                <w:sz w:val="20"/>
+                <w:szCs w:val="20"/>
+              </w:rPr>
+            </w:pPr>
+          </w:p>
+          <w:p>
+            <w:pPr>
+              <w:pStyle w:val="Header"/>
+              <w:rPr>
+                <w:rFonts w:ascii="Book Antiqua" w:hAnsi="Book Antiqua"/>
+                <w:sz w:val="20"/>
+                <w:szCs w:val="20"/>
+              </w:rPr>
+            </w:pPr>
+            <w:r>
+              <w:rPr>
+                <w:rFonts w:ascii="Book Antiqua" w:hAnsi="Book Antiqua"/>
+                <w:sz w:val="20"/>
+                <w:szCs w:val="20"/>
+              </w:rPr>
+              <w:t xml:space="preserve"># as of 02/3/2026 add column 'is new row' to </w:t>
+            </w:r>
+            <w:proofErr w:type="spellStart"/>
+            <w:r>
+              <w:rPr>
+                <w:rFonts w:ascii="Book Antiqua" w:hAnsi="Book Antiqua"/>
+                <w:sz w:val="20"/>
+                <w:szCs w:val="20"/>
+              </w:rPr>
+              <w:t>df</w:t>
+            </w:r>
+            <w:proofErr w:type="spellEnd"/>
+            <w:r>
+              <w:rPr>
+                <w:rFonts w:ascii="Book Antiqua" w:hAnsi="Book Antiqua"/>
+                <w:sz w:val="20"/>
+                <w:szCs w:val="20"/>
+              </w:rPr>
+              <w:t xml:space="preserve"> and set to </w:t>
+            </w:r>
+            <w:proofErr w:type="spellStart"/>
+            <w:r>
+              <w:rPr>
+                <w:rFonts w:ascii="Book Antiqua" w:hAnsi="Book Antiqua"/>
+                <w:sz w:val="20"/>
+                <w:szCs w:val="20"/>
+              </w:rPr>
+              <w:t>np.nan</w:t>
+            </w:r>
+            <w:proofErr w:type="spellEnd"/>
+            <w:r>
+              <w:rPr>
+                <w:rFonts w:ascii="Book Antiqua" w:hAnsi="Book Antiqua"/>
+                <w:sz w:val="20"/>
+                <w:szCs w:val="20"/>
+              </w:rPr>
+              <w:t xml:space="preserve"> (blank)</w:t>
+            </w:r>
+          </w:p>
+          <w:p>
+            <w:pPr>
+              <w:pStyle w:val="Header"/>
+              <w:rPr>
+                <w:rFonts w:ascii="Book Antiqua" w:hAnsi="Book Antiqua"/>
+                <w:sz w:val="20"/>
+                <w:szCs w:val="20"/>
+              </w:rPr>
+            </w:pPr>
+          </w:p>
+          <w:p>
+            <w:pPr>
+              <w:pStyle w:val="Header"/>
+              <w:rPr>
+                <w:rFonts w:ascii="Book Antiqua" w:hAnsi="Book Antiqua"/>
+                <w:sz w:val="20"/>
+                <w:szCs w:val="20"/>
+              </w:rPr>
+            </w:pPr>
+            <w:proofErr w:type="spellStart"/>
+            <w:proofErr w:type="gramStart"/>
+            <w:r>
+              <w:rPr>
+                <w:rFonts w:ascii="Book Antiqua" w:hAnsi="Book Antiqua"/>
+                <w:sz w:val="20"/>
+                <w:szCs w:val="20"/>
+              </w:rPr>
+              <w:t>df</w:t>
+            </w:r>
+            <w:proofErr w:type="spellEnd"/>
+            <w:r>
+              <w:rPr>
+                <w:rFonts w:ascii="Book Antiqua" w:hAnsi="Book Antiqua"/>
+                <w:sz w:val="20"/>
+                <w:szCs w:val="20"/>
+              </w:rPr>
+              <w:t>[</w:t>
+            </w:r>
+            <w:proofErr w:type="gramEnd"/>
+            <w:r>
+              <w:rPr>
+                <w:rFonts w:ascii="Book Antiqua" w:hAnsi="Book Antiqua"/>
+                <w:sz w:val="20"/>
+                <w:szCs w:val="20"/>
+              </w:rPr>
+              <w:t>'Is New Row</w:t>
+            </w:r>
+            <w:proofErr w:type="gramStart"/>
+            <w:r>
+              <w:rPr>
+                <w:rFonts w:ascii="Book Antiqua" w:hAnsi="Book Antiqua"/>
+                <w:sz w:val="20"/>
+                <w:szCs w:val="20"/>
+              </w:rPr>
+              <w:t>']=</w:t>
+            </w:r>
+            <w:proofErr w:type="gramEnd"/>
+            <w:r>
+              <w:rPr>
+                <w:rFonts w:ascii="Book Antiqua" w:hAnsi="Book Antiqua"/>
+                <w:sz w:val="20"/>
+                <w:szCs w:val="20"/>
+              </w:rPr>
+              <w:t xml:space="preserve"> </w:t>
+            </w:r>
+            <w:proofErr w:type="spellStart"/>
+            <w:r>
+              <w:rPr>
+                <w:rFonts w:ascii="Book Antiqua" w:hAnsi="Book Antiqua"/>
+                <w:sz w:val="20"/>
+                <w:szCs w:val="20"/>
+              </w:rPr>
+              <w:t>np.nan</w:t>
+            </w:r>
+            <w:proofErr w:type="spellEnd"/>
+          </w:p>
+          <w:p>
+            <w:pPr>
+              <w:pStyle w:val="Header"/>
+              <w:rPr>
+                <w:rFonts w:ascii="Book Antiqua" w:hAnsi="Book Antiqua"/>
+                <w:sz w:val="20"/>
+                <w:szCs w:val="20"/>
+              </w:rPr>
+            </w:pPr>
+          </w:p>
+          <w:p>
+            <w:pPr>
+              <w:pStyle w:val="Header"/>
+              <w:rPr>
+                <w:rFonts w:ascii="Book Antiqua" w:hAnsi="Book Antiqua"/>
+                <w:sz w:val="20"/>
+                <w:szCs w:val="20"/>
+              </w:rPr>
+            </w:pPr>
+            <w:r>
+              <w:rPr>
+                <w:rFonts w:ascii="Book Antiqua" w:hAnsi="Book Antiqua"/>
+                <w:sz w:val="20"/>
+                <w:szCs w:val="20"/>
+              </w:rPr>
+              <w:t>Line 269 - 270:</w:t>
+            </w:r>
+          </w:p>
+          <w:p>
+            <w:pPr>
+              <w:pStyle w:val="Header"/>
+              <w:rPr>
+                <w:rFonts w:ascii="Book Antiqua" w:hAnsi="Book Antiqua"/>
+                <w:sz w:val="20"/>
+                <w:szCs w:val="20"/>
+              </w:rPr>
+            </w:pPr>
+          </w:p>
+          <w:p>
+            <w:pPr>
+              <w:pStyle w:val="Header"/>
+              <w:rPr>
+                <w:rFonts w:ascii="Book Antiqua" w:hAnsi="Book Antiqua"/>
+                <w:sz w:val="20"/>
+                <w:szCs w:val="20"/>
+              </w:rPr>
+            </w:pPr>
+            <w:r>
+              <w:rPr>
+                <w:rFonts w:ascii="Book Antiqua" w:hAnsi="Book Antiqua"/>
+                <w:sz w:val="20"/>
+                <w:szCs w:val="20"/>
+              </w:rPr>
+              <w:t xml:space="preserve"># as of 02/4/2026 check </w:t>
+            </w:r>
+            <w:proofErr w:type="spellStart"/>
+            <w:r>
+              <w:rPr>
+                <w:rFonts w:ascii="Book Antiqua" w:hAnsi="Book Antiqua"/>
+                <w:sz w:val="20"/>
+                <w:szCs w:val="20"/>
+              </w:rPr>
+              <w:t>dfSelected</w:t>
+            </w:r>
+            <w:proofErr w:type="spellEnd"/>
+            <w:r>
+              <w:rPr>
+                <w:rFonts w:ascii="Book Antiqua" w:hAnsi="Book Antiqua"/>
+                <w:sz w:val="20"/>
+                <w:szCs w:val="20"/>
+              </w:rPr>
+              <w:t xml:space="preserve"> to see if there is/are rows where plan type is in </w:t>
+            </w:r>
+            <w:proofErr w:type="spellStart"/>
+            <w:r>
+              <w:rPr>
+                <w:rFonts w:ascii="Book Antiqua" w:hAnsi="Book Antiqua"/>
+                <w:sz w:val="20"/>
+                <w:szCs w:val="20"/>
+              </w:rPr>
+              <w:t>selectedPlans</w:t>
+            </w:r>
+            <w:proofErr w:type="spellEnd"/>
+          </w:p>
+          <w:p>
+            <w:pPr>
+              <w:pStyle w:val="Header"/>
+              <w:rPr>
+                <w:rFonts w:ascii="Book Antiqua" w:hAnsi="Book Antiqua"/>
+                <w:sz w:val="20"/>
+                <w:szCs w:val="20"/>
+              </w:rPr>
+            </w:pPr>
+          </w:p>
+          <w:p>
+            <w:pPr>
+              <w:pStyle w:val="Header"/>
+              <w:rPr>
+                <w:rFonts w:ascii="Book Antiqua" w:hAnsi="Book Antiqua"/>
+                <w:sz w:val="20"/>
+                <w:szCs w:val="20"/>
+              </w:rPr>
+            </w:pPr>
+            <w:r>
+              <w:rPr>
+                <w:rFonts w:ascii="Book Antiqua" w:hAnsi="Book Antiqua"/>
+                <w:sz w:val="20"/>
+                <w:szCs w:val="20"/>
+              </w:rPr>
+              <w:t xml:space="preserve">if </w:t>
+            </w:r>
+            <w:proofErr w:type="spellStart"/>
+            <w:r>
+              <w:rPr>
+                <w:rFonts w:ascii="Book Antiqua" w:hAnsi="Book Antiqua"/>
+                <w:sz w:val="20"/>
+                <w:szCs w:val="20"/>
+              </w:rPr>
+              <w:t>len</w:t>
+            </w:r>
+            <w:proofErr w:type="spellEnd"/>
+            <w:r>
+              <w:rPr>
+                <w:rFonts w:ascii="Book Antiqua" w:hAnsi="Book Antiqua"/>
+                <w:sz w:val="20"/>
+                <w:szCs w:val="20"/>
+              </w:rPr>
+              <w:t>(</w:t>
+            </w:r>
+            <w:proofErr w:type="spellStart"/>
+            <w:r>
+              <w:rPr>
+                <w:rFonts w:ascii="Book Antiqua" w:hAnsi="Book Antiqua"/>
+                <w:sz w:val="20"/>
+                <w:szCs w:val="20"/>
+              </w:rPr>
+              <w:t>dfSelected</w:t>
+            </w:r>
+            <w:proofErr w:type="spellEnd"/>
+            <w:r>
+              <w:rPr>
+                <w:rFonts w:ascii="Book Antiqua" w:hAnsi="Book Antiqua"/>
+                <w:sz w:val="20"/>
+                <w:szCs w:val="20"/>
+              </w:rPr>
+              <w:t>) ==0:</w:t>
+            </w:r>
+          </w:p>
+          <w:p>
+            <w:pPr>
+              <w:pStyle w:val="Header"/>
+              <w:rPr>
+                <w:rFonts w:ascii="Book Antiqua" w:hAnsi="Book Antiqua"/>
+                <w:sz w:val="20"/>
+                <w:szCs w:val="20"/>
+              </w:rPr>
+            </w:pPr>
+          </w:p>
+          <w:p>
+            <w:pPr>
+              <w:pStyle w:val="Header"/>
+              <w:rPr>
+                <w:rFonts w:ascii="Book Antiqua" w:hAnsi="Book Antiqua"/>
+                <w:sz w:val="20"/>
+                <w:szCs w:val="20"/>
+              </w:rPr>
+            </w:pPr>
+            <w:r>
+              <w:rPr>
+                <w:rFonts w:ascii="Book Antiqua" w:hAnsi="Book Antiqua"/>
+                <w:sz w:val="20"/>
+                <w:szCs w:val="20"/>
+              </w:rPr>
+              <w:t xml:space="preserve">        return "No In-Scope Plan Type"</w:t>
+            </w:r>
+          </w:p>
+          <w:p>
+            <w:pPr>
+              <w:pStyle w:val="Header"/>
+              <w:rPr>
+                <w:rFonts w:ascii="Book Antiqua" w:hAnsi="Book Antiqua"/>
+                <w:sz w:val="20"/>
+                <w:szCs w:val="20"/>
+              </w:rPr>
+            </w:pPr>
+          </w:p>
+          <w:p>
+            <w:pPr>
+              <w:pStyle w:val="Header"/>
+              <w:rPr>
+                <w:rFonts w:ascii="Book Antiqua" w:hAnsi="Book Antiqua"/>
+                <w:sz w:val="20"/>
+                <w:szCs w:val="20"/>
+              </w:rPr>
+            </w:pPr>
+            <w:r>
+              <w:rPr>
+                <w:rFonts w:ascii="Book Antiqua" w:hAnsi="Book Antiqua"/>
+                <w:sz w:val="20"/>
+                <w:szCs w:val="20"/>
+              </w:rPr>
+              <w:t>Line 291 - 292:</w:t>
+            </w:r>
+          </w:p>
+          <w:p>
+            <w:pPr>
+              <w:pStyle w:val="Header"/>
+              <w:rPr>
+                <w:rFonts w:ascii="Book Antiqua" w:hAnsi="Book Antiqua"/>
+                <w:sz w:val="20"/>
+                <w:szCs w:val="20"/>
+              </w:rPr>
+            </w:pPr>
+          </w:p>
+          <w:p>
+            <w:pPr>
+              <w:pStyle w:val="Header"/>
+              <w:rPr>
+                <w:rFonts w:ascii="Book Antiqua" w:hAnsi="Book Antiqua"/>
+                <w:sz w:val="20"/>
+                <w:szCs w:val="20"/>
+              </w:rPr>
+            </w:pPr>
+            <w:r>
+              <w:rPr>
+                <w:rFonts w:ascii="Book Antiqua" w:hAnsi="Book Antiqua"/>
+                <w:sz w:val="20"/>
+                <w:szCs w:val="20"/>
+              </w:rPr>
+              <w:t># as of 02/4/2026 add If ~</w:t>
+            </w:r>
+            <w:proofErr w:type="spellStart"/>
+            <w:proofErr w:type="gramStart"/>
+            <w:r>
+              <w:rPr>
+                <w:rFonts w:ascii="Book Antiqua" w:hAnsi="Book Antiqua"/>
+                <w:sz w:val="20"/>
+                <w:szCs w:val="20"/>
+              </w:rPr>
+              <w:t>df</w:t>
+            </w:r>
+            <w:proofErr w:type="spellEnd"/>
+            <w:r>
+              <w:rPr>
+                <w:rFonts w:ascii="Book Antiqua" w:hAnsi="Book Antiqua"/>
+                <w:sz w:val="20"/>
+                <w:szCs w:val="20"/>
+              </w:rPr>
+              <w:t>[</w:t>
+            </w:r>
+            <w:proofErr w:type="gramEnd"/>
+            <w:r>
+              <w:rPr>
+                <w:rFonts w:ascii="Book Antiqua" w:hAnsi="Book Antiqua"/>
+                <w:sz w:val="20"/>
+                <w:szCs w:val="20"/>
+              </w:rPr>
+              <w:t>'Is New Row'</w:t>
+            </w:r>
+            <w:proofErr w:type="gramStart"/>
+            <w:r>
+              <w:rPr>
+                <w:rFonts w:ascii="Book Antiqua" w:hAnsi="Book Antiqua"/>
+                <w:sz w:val="20"/>
+                <w:szCs w:val="20"/>
+              </w:rPr>
+              <w:t>].any</w:t>
+            </w:r>
+            <w:proofErr w:type="gramEnd"/>
+            <w:r>
+              <w:rPr>
+                <w:rFonts w:ascii="Book Antiqua" w:hAnsi="Book Antiqua"/>
+                <w:sz w:val="20"/>
+                <w:szCs w:val="20"/>
+              </w:rPr>
+              <w:t xml:space="preserve">() which will return True if there is no value in that column that is true. </w:t>
+            </w:r>
+            <w:proofErr w:type="spellStart"/>
+            <w:r>
+              <w:rPr>
+                <w:rFonts w:ascii="Book Antiqua" w:hAnsi="Book Antiqua"/>
+                <w:sz w:val="20"/>
+                <w:szCs w:val="20"/>
+              </w:rPr>
+              <w:t>np.nan</w:t>
+            </w:r>
+            <w:proofErr w:type="spellEnd"/>
+            <w:r>
+              <w:rPr>
+                <w:rFonts w:ascii="Book Antiqua" w:hAnsi="Book Antiqua"/>
+                <w:sz w:val="20"/>
+                <w:szCs w:val="20"/>
+              </w:rPr>
+              <w:t xml:space="preserve"> is ignored in this </w:t>
+            </w:r>
+            <w:proofErr w:type="spellStart"/>
+            <w:r>
+              <w:rPr>
+                <w:rFonts w:ascii="Book Antiqua" w:hAnsi="Book Antiqua"/>
+                <w:sz w:val="20"/>
+                <w:szCs w:val="20"/>
+              </w:rPr>
+              <w:t>boolean</w:t>
+            </w:r>
+            <w:proofErr w:type="spellEnd"/>
+          </w:p>
+          <w:p>
+            <w:pPr>
+              <w:pStyle w:val="Header"/>
+              <w:rPr>
+                <w:rFonts w:ascii="Book Antiqua" w:hAnsi="Book Antiqua"/>
+                <w:sz w:val="20"/>
+                <w:szCs w:val="20"/>
+              </w:rPr>
+            </w:pPr>
+          </w:p>
+          <w:p>
+            <w:pPr>
+              <w:pStyle w:val="Header"/>
+              <w:rPr>
+                <w:rFonts w:ascii="Book Antiqua" w:hAnsi="Book Antiqua"/>
+                <w:sz w:val="20"/>
+                <w:szCs w:val="20"/>
+              </w:rPr>
+            </w:pPr>
+            <w:r>
+              <w:rPr>
+                <w:rFonts w:ascii="Book Antiqua" w:hAnsi="Book Antiqua"/>
+                <w:sz w:val="20"/>
+                <w:szCs w:val="20"/>
+              </w:rPr>
+              <w:t xml:space="preserve">if ~ </w:t>
+            </w:r>
+            <w:proofErr w:type="spellStart"/>
+            <w:proofErr w:type="gramStart"/>
+            <w:r>
+              <w:rPr>
+                <w:rFonts w:ascii="Book Antiqua" w:hAnsi="Book Antiqua"/>
+                <w:sz w:val="20"/>
+                <w:szCs w:val="20"/>
+              </w:rPr>
+              <w:t>df</w:t>
+            </w:r>
+            <w:proofErr w:type="spellEnd"/>
+            <w:r>
+              <w:rPr>
+                <w:rFonts w:ascii="Book Antiqua" w:hAnsi="Book Antiqua"/>
+                <w:sz w:val="20"/>
+                <w:szCs w:val="20"/>
+              </w:rPr>
+              <w:t>[</w:t>
+            </w:r>
+            <w:proofErr w:type="gramEnd"/>
+            <w:r>
+              <w:rPr>
+                <w:rFonts w:ascii="Book Antiqua" w:hAnsi="Book Antiqua"/>
+                <w:sz w:val="20"/>
+                <w:szCs w:val="20"/>
+              </w:rPr>
+              <w:t>'Is New Row'</w:t>
+            </w:r>
+            <w:proofErr w:type="gramStart"/>
+            <w:r>
+              <w:rPr>
+                <w:rFonts w:ascii="Book Antiqua" w:hAnsi="Book Antiqua"/>
+                <w:sz w:val="20"/>
+                <w:szCs w:val="20"/>
+              </w:rPr>
+              <w:t>].any</w:t>
+            </w:r>
+            <w:proofErr w:type="gramEnd"/>
+            <w:r>
+              <w:rPr>
+                <w:rFonts w:ascii="Book Antiqua" w:hAnsi="Book Antiqua"/>
+                <w:sz w:val="20"/>
+                <w:szCs w:val="20"/>
+              </w:rPr>
+              <w:t>():</w:t>
+            </w:r>
+          </w:p>
+          <w:p>
+            <w:pPr>
+              <w:pStyle w:val="Header"/>
+              <w:rPr>
+                <w:rFonts w:ascii="Book Antiqua" w:hAnsi="Book Antiqua"/>
+                <w:sz w:val="20"/>
+                <w:szCs w:val="20"/>
+              </w:rPr>
+            </w:pPr>
+          </w:p>
+          <w:p>
+            <w:pPr>
+              <w:pStyle w:val="Header"/>
+              <w:rPr>
+                <w:rFonts w:ascii="Book Antiqua" w:hAnsi="Book Antiqua"/>
+                <w:sz w:val="20"/>
+                <w:szCs w:val="20"/>
+              </w:rPr>
+            </w:pPr>
+            <w:r>
+              <w:rPr>
+                <w:rFonts w:ascii="Book Antiqua" w:hAnsi="Book Antiqua"/>
+                <w:sz w:val="20"/>
+                <w:szCs w:val="20"/>
+              </w:rPr>
+              <w:t xml:space="preserve">        </w:t>
+            </w:r>
+            <w:proofErr w:type="spellStart"/>
+            <w:r>
+              <w:rPr>
+                <w:rFonts w:ascii="Book Antiqua" w:hAnsi="Book Antiqua"/>
+                <w:sz w:val="20"/>
+                <w:szCs w:val="20"/>
+              </w:rPr>
+              <w:t>return"No</w:t>
+            </w:r>
+            <w:proofErr w:type="spellEnd"/>
+            <w:r>
+              <w:rPr>
+                <w:rFonts w:ascii="Book Antiqua" w:hAnsi="Book Antiqua"/>
+                <w:sz w:val="20"/>
+                <w:szCs w:val="20"/>
+              </w:rPr>
+              <w:t xml:space="preserve"> Missed Paycheck Date"</w:t>
+            </w:r>
+          </w:p>
+        </w:tc>
+        <w:tc>
+          <w:tcPr>
+            <w:tcW w:w="2574" w:type="dxa"/>
+          </w:tcPr>
+          <w:p>
+            <w:pPr>
+              <w:pStyle w:val="Header"/>
+              <w:rPr>
+                <w:rFonts w:ascii="Book Antiqua" w:hAnsi="Book Antiqua"/>
+                <w:sz w:val="20"/>
+                <w:szCs w:val="20"/>
+              </w:rPr>
+            </w:pPr>
+          </w:p>
+        </w:tc>
+      </w:tr>
+      <w:tr>
+        <w:tc>
+          <w:tcPr>
+            <w:tcW w:w="618" w:type="dxa"/>
+          </w:tcPr>
+          <w:p>
+            <w:pPr>
+              <w:pStyle w:val="Header"/>
+              <w:rPr>
+                <w:rFonts w:ascii="Book Antiqua" w:hAnsi="Book Antiqua"/>
+                <w:sz w:val="20"/>
+                <w:szCs w:val="20"/>
+              </w:rPr>
+            </w:pPr>
+            <w:r>
+              <w:rPr>
+                <w:rFonts w:ascii="Book Antiqua" w:hAnsi="Book Antiqua"/>
+                <w:sz w:val="20"/>
+                <w:szCs w:val="20"/>
+              </w:rPr>
+              <w:t>2.0</w:t>
+            </w:r>
+          </w:p>
+        </w:tc>
+        <w:tc>
+          <w:tcPr>
+            <w:tcW w:w="1896" w:type="dxa"/>
+          </w:tcPr>
+          <w:p>
+            <w:pPr>
+              <w:pStyle w:val="Header"/>
+              <w:rPr>
+                <w:rFonts w:ascii="Book Antiqua" w:hAnsi="Book Antiqua"/>
+                <w:sz w:val="20"/>
+                <w:szCs w:val="20"/>
+              </w:rPr>
+            </w:pPr>
+            <w:r>
+              <w:rPr>
+                <w:rFonts w:ascii="Book Antiqua" w:hAnsi="Book Antiqua"/>
+                <w:sz w:val="20"/>
+                <w:szCs w:val="20"/>
+              </w:rPr>
+              <w:t>RFL-5- DataProcessFin001 task bot</w:t>
+            </w:r>
+          </w:p>
+        </w:tc>
+        <w:tc>
+          <w:tcPr>
+            <w:tcW w:w="4082" w:type="dxa"/>
+          </w:tcPr>
+          <w:p>
+            <w:pPr>
+              <w:pStyle w:val="Header"/>
+              <w:rPr>
+                <w:rFonts w:ascii="Book Antiqua" w:hAnsi="Book Antiqua"/>
+                <w:sz w:val="20"/>
+                <w:szCs w:val="20"/>
+              </w:rPr>
+            </w:pPr>
+            <w:r>
+              <w:rPr>
+                <w:rFonts w:ascii="Book Antiqua" w:hAnsi="Book Antiqua"/>
+                <w:sz w:val="20"/>
+                <w:szCs w:val="20"/>
+              </w:rPr>
+              <w:t>Added lines 28 - 35 to handle the scenario 1 i.e. when FIN001 does not contain in-scope plan type</w:t>
+            </w:r>
+          </w:p>
+        </w:tc>
+        <w:tc>
+          <w:tcPr>
+            <w:tcW w:w="2574" w:type="dxa"/>
+          </w:tcPr>
+          <w:p>
+            <w:pPr>
+              <w:pStyle w:val="Header"/>
+              <w:rPr>
+                <w:rFonts w:ascii="Book Antiqua" w:hAnsi="Book Antiqua"/>
+                <w:sz w:val="20"/>
+                <w:szCs w:val="20"/>
+              </w:rPr>
+            </w:pPr>
+          </w:p>
+        </w:tc>
+      </w:tr>
+      <w:tr>
+        <w:tc>
+          <w:tcPr>
+            <w:tcW w:w="618" w:type="dxa"/>
+          </w:tcPr>
+          <w:p>
+            <w:pPr>
+              <w:pStyle w:val="Header"/>
+              <w:rPr>
+                <w:rFonts w:ascii="Book Antiqua" w:hAnsi="Book Antiqua"/>
+                <w:sz w:val="20"/>
+                <w:szCs w:val="20"/>
+              </w:rPr>
+            </w:pPr>
+            <w:r>
+              <w:rPr>
+                <w:rFonts w:ascii="Book Antiqua" w:hAnsi="Book Antiqua"/>
+                <w:sz w:val="20"/>
+                <w:szCs w:val="20"/>
+              </w:rPr>
+              <w:t>2.1</w:t>
+            </w:r>
+          </w:p>
+        </w:tc>
+        <w:tc>
+          <w:tcPr>
+            <w:tcW w:w="1896" w:type="dxa"/>
+          </w:tcPr>
+          <w:p>
+            <w:pPr>
+              <w:pStyle w:val="Header"/>
+              <w:rPr>
+                <w:rFonts w:ascii="Book Antiqua" w:hAnsi="Book Antiqua"/>
+                <w:sz w:val="20"/>
+                <w:szCs w:val="20"/>
+              </w:rPr>
+            </w:pPr>
+          </w:p>
+        </w:tc>
+        <w:tc>
+          <w:tcPr>
+            <w:tcW w:w="4082" w:type="dxa"/>
+          </w:tcPr>
+          <w:p>
+            <w:pPr>
+              <w:pStyle w:val="Header"/>
+              <w:rPr>
+                <w:rFonts w:ascii="Book Antiqua" w:hAnsi="Book Antiqua"/>
+                <w:sz w:val="20"/>
+                <w:szCs w:val="20"/>
+              </w:rPr>
+            </w:pPr>
+            <w:r>
+              <w:rPr>
+                <w:rFonts w:ascii="Book Antiqua" w:hAnsi="Book Antiqua"/>
+                <w:sz w:val="20"/>
+                <w:szCs w:val="20"/>
+              </w:rPr>
+              <w:t>Added lines 36- 42 to handle scenario 2 i.e. when FIN001 contains any selected plan type(s) however there is no missed paycheck date identified.</w:t>
+            </w:r>
+          </w:p>
+        </w:tc>
+        <w:tc>
+          <w:tcPr>
+            <w:tcW w:w="2574" w:type="dxa"/>
+          </w:tcPr>
+          <w:p>
+            <w:pPr>
+              <w:pStyle w:val="Header"/>
+              <w:rPr>
+                <w:rFonts w:ascii="Book Antiqua" w:hAnsi="Book Antiqua"/>
+                <w:sz w:val="20"/>
+                <w:szCs w:val="20"/>
+              </w:rPr>
+            </w:pPr>
+          </w:p>
+        </w:tc>
+      </w:tr>
+    </w:tbl>
+    <w:p>
+      <w:pPr>
+        <w:pStyle w:val="Header"/>
+        <w:ind w:left="180"/>
+        <w:rPr>
+          <w:rFonts w:ascii="Book Antiqua" w:hAnsi="Book Antiqua"/>
+          <w:sz w:val="24"/>
+          <w:szCs w:val="24"/>
+        </w:rPr>
+      </w:pPr>
+    </w:p>
+    <w:p>
+      <w:pPr>
+        <w:pStyle w:val="Header"/>
+        <w:numPr>
+          <w:ilvl w:val="3"/>
+          <w:numId w:val="42"/>
+        </w:numPr>
+        <w:ind w:left="900"/>
+        <w:rPr>
+          <w:rFonts w:ascii="Book Antiqua" w:hAnsi="Book Antiqua"/>
+          <w:sz w:val="24"/>
+          <w:szCs w:val="24"/>
+        </w:rPr>
+      </w:pPr>
+      <w:r>
+        <w:rPr>
+          <w:rFonts w:ascii="Book Antiqua" w:hAnsi="Book Antiqua"/>
+          <w:sz w:val="24"/>
+          <w:szCs w:val="24"/>
+        </w:rPr>
+        <w:t xml:space="preserve">Changes per </w:t>
+      </w:r>
+      <w:hyperlink r:id="rId58" w:history="1">
+        <w:r>
+          <w:rPr>
+            <w:rStyle w:val="Hyperlink"/>
+            <w:rFonts w:ascii="Book Antiqua" w:hAnsi="Book Antiqua"/>
+            <w:sz w:val="24"/>
+            <w:szCs w:val="24"/>
+          </w:rPr>
+          <w:t>UCP-188100</w:t>
+        </w:r>
+      </w:hyperlink>
+    </w:p>
+    <w:tbl>
+      <w:tblPr>
+        <w:tblStyle w:val="TableGrid"/>
+        <w:tblW w:w="0" w:type="auto"/>
+        <w:tblInd w:w="180" w:type="dxa"/>
+        <w:tblLayout w:type="fixed"/>
+        <w:tblLook w:val="04A0" w:firstRow="1" w:lastRow="0" w:firstColumn="1" w:lastColumn="0" w:noHBand="0" w:noVBand="1"/>
+      </w:tblPr>
+      <w:tblGrid>
+        <w:gridCol w:w="625"/>
+        <w:gridCol w:w="1735"/>
+        <w:gridCol w:w="4179"/>
+        <w:gridCol w:w="2631"/>
+      </w:tblGrid>
+      <w:tr>
+        <w:tc>
+          <w:tcPr>
+            <w:tcW w:w="625" w:type="dxa"/>
+          </w:tcPr>
+          <w:p>
+            <w:pPr>
+              <w:pStyle w:val="Header"/>
+              <w:rPr>
+                <w:rFonts w:ascii="Book Antiqua" w:hAnsi="Book Antiqua"/>
+                <w:sz w:val="20"/>
+                <w:szCs w:val="20"/>
+              </w:rPr>
+            </w:pPr>
+            <w:r>
+              <w:rPr>
+                <w:rFonts w:ascii="Book Antiqua" w:eastAsia="Calibri" w:hAnsi="Book Antiqua"/>
+                <w:sz w:val="20"/>
+                <w:szCs w:val="20"/>
+              </w:rPr>
+              <w:t>No</w:t>
+            </w:r>
+          </w:p>
+        </w:tc>
+        <w:tc>
+          <w:tcPr>
+            <w:tcW w:w="1735" w:type="dxa"/>
+          </w:tcPr>
+          <w:p>
+            <w:pPr>
+              <w:pStyle w:val="Header"/>
+              <w:rPr>
+                <w:rFonts w:ascii="Book Antiqua" w:hAnsi="Book Antiqua"/>
+                <w:sz w:val="20"/>
+                <w:szCs w:val="20"/>
+              </w:rPr>
+            </w:pPr>
+            <w:r>
+              <w:rPr>
+                <w:rFonts w:ascii="Book Antiqua" w:hAnsi="Book Antiqua"/>
+                <w:sz w:val="20"/>
+                <w:szCs w:val="20"/>
+              </w:rPr>
+              <w:t>Task Bot Name</w:t>
+            </w:r>
+          </w:p>
+        </w:tc>
+        <w:tc>
+          <w:tcPr>
+            <w:tcW w:w="4179" w:type="dxa"/>
+          </w:tcPr>
+          <w:p>
+            <w:pPr>
+              <w:pStyle w:val="Header"/>
+              <w:rPr>
+                <w:rFonts w:ascii="Book Antiqua" w:hAnsi="Book Antiqua"/>
+                <w:sz w:val="20"/>
+                <w:szCs w:val="20"/>
+              </w:rPr>
+            </w:pPr>
+            <w:r>
+              <w:rPr>
+                <w:rFonts w:ascii="Book Antiqua" w:hAnsi="Book Antiqua"/>
+                <w:sz w:val="20"/>
+                <w:szCs w:val="20"/>
+              </w:rPr>
+              <w:t>Change Description (what has been changed)</w:t>
+            </w:r>
+          </w:p>
+        </w:tc>
+        <w:tc>
+          <w:tcPr>
+            <w:tcW w:w="2631" w:type="dxa"/>
+          </w:tcPr>
+          <w:p>
+            <w:pPr>
+              <w:pStyle w:val="Header"/>
+              <w:rPr>
+                <w:rFonts w:ascii="Book Antiqua" w:hAnsi="Book Antiqua"/>
+                <w:sz w:val="20"/>
+                <w:szCs w:val="20"/>
+              </w:rPr>
+            </w:pPr>
+            <w:r>
+              <w:rPr>
+                <w:rFonts w:ascii="Book Antiqua" w:hAnsi="Book Antiqua"/>
+                <w:sz w:val="20"/>
+                <w:szCs w:val="20"/>
+              </w:rPr>
+              <w:t>Reason/ Justification</w:t>
+            </w:r>
+          </w:p>
+        </w:tc>
+      </w:tr>
+      <w:tr>
+        <w:tc>
+          <w:tcPr>
+            <w:tcW w:w="625" w:type="dxa"/>
+          </w:tcPr>
+          <w:p>
+            <w:pPr>
+              <w:pStyle w:val="Header"/>
+              <w:rPr>
+                <w:rFonts w:ascii="Book Antiqua" w:hAnsi="Book Antiqua"/>
+                <w:sz w:val="20"/>
+                <w:szCs w:val="20"/>
+              </w:rPr>
+            </w:pPr>
+            <w:r>
+              <w:rPr>
+                <w:rFonts w:ascii="Book Antiqua" w:hAnsi="Book Antiqua"/>
+                <w:sz w:val="20"/>
+                <w:szCs w:val="20"/>
+              </w:rPr>
+              <w:lastRenderedPageBreak/>
+              <w:t>1</w:t>
+            </w:r>
+            <w:r>
+              <w:rPr>
+                <w:rFonts w:ascii="Book Antiqua" w:hAnsi="Book Antiqua"/>
+                <w:sz w:val="20"/>
+                <w:szCs w:val="20"/>
+              </w:rPr>
+              <w:t>.0</w:t>
+            </w:r>
+          </w:p>
+        </w:tc>
+        <w:tc>
+          <w:tcPr>
+            <w:tcW w:w="1735" w:type="dxa"/>
+          </w:tcPr>
+          <w:p>
+            <w:pPr>
+              <w:pStyle w:val="Header"/>
+              <w:rPr>
+                <w:rFonts w:ascii="Book Antiqua" w:hAnsi="Book Antiqua"/>
+                <w:sz w:val="20"/>
+                <w:szCs w:val="20"/>
+              </w:rPr>
+            </w:pPr>
+            <w:r>
+              <w:rPr>
+                <w:rFonts w:ascii="Book Antiqua" w:hAnsi="Book Antiqua"/>
+                <w:sz w:val="20"/>
+                <w:szCs w:val="20"/>
+              </w:rPr>
+              <w:t>RFL-3-CheckArrears</w:t>
+            </w:r>
+          </w:p>
+        </w:tc>
+        <w:tc>
+          <w:tcPr>
+            <w:tcW w:w="4179" w:type="dxa"/>
+          </w:tcPr>
+          <w:p>
+            <w:pPr>
+              <w:pStyle w:val="Header"/>
+              <w:rPr>
+                <w:rFonts w:ascii="Book Antiqua" w:hAnsi="Book Antiqua"/>
+                <w:sz w:val="20"/>
+                <w:szCs w:val="20"/>
+              </w:rPr>
+            </w:pPr>
+            <w:r>
+              <w:rPr>
+                <w:rFonts w:ascii="Book Antiqua" w:hAnsi="Book Antiqua"/>
+                <w:sz w:val="20"/>
+                <w:szCs w:val="20"/>
+              </w:rPr>
+              <w:t>Line 16</w:t>
+            </w:r>
+            <w:r>
+              <w:rPr>
+                <w:rFonts w:ascii="Book Antiqua" w:hAnsi="Book Antiqua"/>
+                <w:sz w:val="20"/>
+                <w:szCs w:val="20"/>
+              </w:rPr>
+              <w:t xml:space="preserve"> - </w:t>
+            </w:r>
+            <w:r>
+              <w:rPr>
+                <w:rFonts w:ascii="Book Antiqua" w:hAnsi="Book Antiqua"/>
+                <w:sz w:val="20"/>
+                <w:szCs w:val="20"/>
+              </w:rPr>
+              <w:t>remove “string $rTableRow2[</w:t>
+            </w:r>
+            <w:proofErr w:type="gramStart"/>
+            <w:r>
+              <w:rPr>
+                <w:rFonts w:ascii="Book Antiqua" w:hAnsi="Book Antiqua"/>
+                <w:sz w:val="20"/>
+                <w:szCs w:val="20"/>
+              </w:rPr>
+              <w:t>13]$</w:t>
+            </w:r>
+            <w:proofErr w:type="gramEnd"/>
+            <w:r>
+              <w:rPr>
+                <w:rFonts w:ascii="Book Antiqua" w:hAnsi="Book Antiqua"/>
+                <w:sz w:val="20"/>
+                <w:szCs w:val="20"/>
+              </w:rPr>
+              <w:t xml:space="preserve"> Not Equal to Active”</w:t>
+            </w:r>
+            <w:r>
+              <w:rPr>
+                <w:rFonts w:ascii="Book Antiqua" w:hAnsi="Book Antiqua"/>
+                <w:sz w:val="20"/>
+                <w:szCs w:val="20"/>
+              </w:rPr>
+              <w:t xml:space="preserve"> o</w:t>
+            </w:r>
+            <w:r>
+              <w:rPr>
+                <w:rFonts w:ascii="Book Antiqua" w:hAnsi="Book Antiqua"/>
+                <w:sz w:val="20"/>
+                <w:szCs w:val="20"/>
+              </w:rPr>
+              <w:t>n IF statement</w:t>
+            </w:r>
+          </w:p>
+        </w:tc>
+        <w:tc>
+          <w:tcPr>
+            <w:tcW w:w="2631" w:type="dxa"/>
+          </w:tcPr>
+          <w:p>
+            <w:pPr>
+              <w:pStyle w:val="Header"/>
+              <w:rPr>
+                <w:rFonts w:ascii="Book Antiqua" w:hAnsi="Book Antiqua"/>
+                <w:sz w:val="20"/>
+                <w:szCs w:val="20"/>
+              </w:rPr>
+            </w:pPr>
+            <w:r>
+              <w:rPr>
+                <w:rFonts w:ascii="Book Antiqua" w:hAnsi="Book Antiqua"/>
+                <w:sz w:val="20"/>
+                <w:szCs w:val="20"/>
+              </w:rPr>
+              <w:t>$rTableRow2[</w:t>
+            </w:r>
+            <w:proofErr w:type="gramStart"/>
+            <w:r>
+              <w:rPr>
+                <w:rFonts w:ascii="Book Antiqua" w:hAnsi="Book Antiqua"/>
+                <w:sz w:val="20"/>
+                <w:szCs w:val="20"/>
+              </w:rPr>
+              <w:t>13]$</w:t>
+            </w:r>
+            <w:proofErr w:type="gramEnd"/>
+            <w:r>
+              <w:rPr>
+                <w:rFonts w:ascii="Book Antiqua" w:hAnsi="Book Antiqua"/>
+                <w:sz w:val="20"/>
+                <w:szCs w:val="20"/>
+              </w:rPr>
+              <w:t xml:space="preserve"> refers to Payroll Status read from Job Data. Since all Payroll Status should be included this condition is no longer needed.</w:t>
+            </w:r>
+          </w:p>
+        </w:tc>
+      </w:tr>
+      <w:tr>
+        <w:tc>
+          <w:tcPr>
+            <w:tcW w:w="625" w:type="dxa"/>
+          </w:tcPr>
+          <w:p>
+            <w:pPr>
+              <w:pStyle w:val="Header"/>
+              <w:rPr>
+                <w:rFonts w:ascii="Book Antiqua" w:hAnsi="Book Antiqua"/>
+                <w:sz w:val="20"/>
+                <w:szCs w:val="20"/>
+              </w:rPr>
+            </w:pPr>
+            <w:r>
+              <w:rPr>
+                <w:rFonts w:ascii="Book Antiqua" w:hAnsi="Book Antiqua"/>
+                <w:sz w:val="20"/>
+                <w:szCs w:val="20"/>
+              </w:rPr>
+              <w:t>1.1</w:t>
+            </w:r>
+          </w:p>
+        </w:tc>
+        <w:tc>
+          <w:tcPr>
+            <w:tcW w:w="1735" w:type="dxa"/>
+          </w:tcPr>
+          <w:p>
+            <w:pPr>
+              <w:pStyle w:val="Header"/>
+              <w:rPr>
+                <w:rFonts w:ascii="Book Antiqua" w:hAnsi="Book Antiqua"/>
+                <w:sz w:val="20"/>
+                <w:szCs w:val="20"/>
+              </w:rPr>
+            </w:pPr>
+          </w:p>
+        </w:tc>
+        <w:tc>
+          <w:tcPr>
+            <w:tcW w:w="4179" w:type="dxa"/>
+          </w:tcPr>
+          <w:p>
+            <w:pPr>
+              <w:pStyle w:val="Header"/>
+              <w:rPr>
+                <w:rFonts w:ascii="Book Antiqua" w:hAnsi="Book Antiqua"/>
+                <w:sz w:val="20"/>
+                <w:szCs w:val="20"/>
+              </w:rPr>
+            </w:pPr>
+            <w:r>
+              <w:rPr>
+                <w:rFonts w:ascii="Book Antiqua" w:hAnsi="Book Antiqua"/>
+                <w:sz w:val="20"/>
+                <w:szCs w:val="20"/>
+              </w:rPr>
+              <w:t>Disable all Steps</w:t>
+            </w:r>
+          </w:p>
+        </w:tc>
+        <w:tc>
+          <w:tcPr>
+            <w:tcW w:w="2631" w:type="dxa"/>
+          </w:tcPr>
+          <w:p>
+            <w:pPr>
+              <w:pStyle w:val="Header"/>
+              <w:rPr>
+                <w:rFonts w:ascii="Book Antiqua" w:hAnsi="Book Antiqua"/>
+                <w:sz w:val="20"/>
+                <w:szCs w:val="20"/>
+              </w:rPr>
+            </w:pPr>
+            <w:r>
+              <w:rPr>
+                <w:rFonts w:ascii="Book Antiqua" w:hAnsi="Book Antiqua"/>
+                <w:sz w:val="20"/>
+                <w:szCs w:val="20"/>
+              </w:rPr>
+              <w:t>All actions in task bot are disabled and not deleted. Disabling the actions gives us an option to enable them again in the future.</w:t>
+            </w:r>
+          </w:p>
+        </w:tc>
+      </w:tr>
+      <w:tr>
+        <w:tc>
+          <w:tcPr>
+            <w:tcW w:w="625" w:type="dxa"/>
+          </w:tcPr>
+          <w:p>
+            <w:pPr>
+              <w:pStyle w:val="Header"/>
+              <w:rPr>
+                <w:rFonts w:ascii="Book Antiqua" w:hAnsi="Book Antiqua"/>
+                <w:sz w:val="20"/>
+                <w:szCs w:val="20"/>
+              </w:rPr>
+            </w:pPr>
+            <w:r>
+              <w:rPr>
+                <w:rFonts w:ascii="Book Antiqua" w:hAnsi="Book Antiqua"/>
+                <w:sz w:val="20"/>
+                <w:szCs w:val="20"/>
+              </w:rPr>
+              <w:t>1.2</w:t>
+            </w:r>
+          </w:p>
+        </w:tc>
+        <w:tc>
+          <w:tcPr>
+            <w:tcW w:w="1735" w:type="dxa"/>
+          </w:tcPr>
+          <w:p>
+            <w:pPr>
+              <w:pStyle w:val="Header"/>
+              <w:rPr>
+                <w:rFonts w:ascii="Book Antiqua" w:hAnsi="Book Antiqua"/>
+                <w:sz w:val="20"/>
+                <w:szCs w:val="20"/>
+              </w:rPr>
+            </w:pPr>
+          </w:p>
+        </w:tc>
+        <w:tc>
+          <w:tcPr>
+            <w:tcW w:w="4179" w:type="dxa"/>
+          </w:tcPr>
+          <w:p>
+            <w:pPr>
+              <w:pStyle w:val="Header"/>
+              <w:rPr>
+                <w:rFonts w:ascii="Book Antiqua" w:hAnsi="Book Antiqua"/>
+                <w:sz w:val="20"/>
+                <w:szCs w:val="20"/>
+              </w:rPr>
+            </w:pPr>
+            <w:r>
+              <w:rPr>
+                <w:rFonts w:ascii="Book Antiqua" w:hAnsi="Book Antiqua"/>
+                <w:sz w:val="20"/>
+                <w:szCs w:val="20"/>
+              </w:rPr>
+              <w:t xml:space="preserve">(Secondary change) </w:t>
+            </w:r>
+            <w:r>
+              <w:rPr>
+                <w:rFonts w:ascii="Book Antiqua" w:hAnsi="Book Antiqua"/>
+                <w:sz w:val="20"/>
+                <w:szCs w:val="20"/>
+              </w:rPr>
+              <w:t>Line 189 – 190: Change the filename TestTInputDataTable-checkedArrears_$sDateTime$.csv to List_of_Recon_Ready_EEID_$sDateTime$.csv</w:t>
+            </w:r>
+          </w:p>
+        </w:tc>
+        <w:tc>
+          <w:tcPr>
+            <w:tcW w:w="2631" w:type="dxa"/>
+          </w:tcPr>
+          <w:p>
+            <w:pPr>
+              <w:pStyle w:val="Header"/>
+              <w:rPr>
+                <w:rFonts w:ascii="Book Antiqua" w:hAnsi="Book Antiqua"/>
+                <w:sz w:val="20"/>
+                <w:szCs w:val="20"/>
+              </w:rPr>
+            </w:pPr>
+            <w:proofErr w:type="spellStart"/>
+            <w:r>
+              <w:rPr>
+                <w:rFonts w:ascii="Book Antiqua" w:hAnsi="Book Antiqua"/>
+                <w:sz w:val="20"/>
+                <w:szCs w:val="20"/>
+              </w:rPr>
+              <w:t>List_of_Recon_Ready_EEID</w:t>
+            </w:r>
+            <w:proofErr w:type="spellEnd"/>
+            <w:r>
+              <w:rPr>
+                <w:rFonts w:ascii="Book Antiqua" w:hAnsi="Book Antiqua"/>
+                <w:sz w:val="20"/>
+                <w:szCs w:val="20"/>
+              </w:rPr>
+              <w:t xml:space="preserve"> (csv) file contains the list of EEID filtered on Job Indicator, Payroll Status, and Arrears. This is the list of EEID that advance to the next steps which include: FIN001 report extraction and formatting, OCF payment and TRA report extraction and formatting. The previous file name is ambiguous and is confusing.</w:t>
+            </w:r>
+          </w:p>
+        </w:tc>
+      </w:tr>
+      <w:tr>
+        <w:tc>
+          <w:tcPr>
+            <w:tcW w:w="625" w:type="dxa"/>
+          </w:tcPr>
+          <w:p>
+            <w:pPr>
+              <w:pStyle w:val="Header"/>
+              <w:rPr>
+                <w:rFonts w:ascii="Book Antiqua" w:hAnsi="Book Antiqua"/>
+                <w:sz w:val="20"/>
+                <w:szCs w:val="20"/>
+              </w:rPr>
+            </w:pPr>
+            <w:r>
+              <w:rPr>
+                <w:rFonts w:ascii="Book Antiqua" w:hAnsi="Book Antiqua"/>
+                <w:sz w:val="20"/>
+                <w:szCs w:val="20"/>
+              </w:rPr>
+              <w:t>1.3</w:t>
+            </w:r>
+          </w:p>
+        </w:tc>
+        <w:tc>
+          <w:tcPr>
+            <w:tcW w:w="1735" w:type="dxa"/>
+          </w:tcPr>
+          <w:p>
+            <w:pPr>
+              <w:pStyle w:val="Header"/>
+              <w:rPr>
+                <w:rFonts w:ascii="Book Antiqua" w:hAnsi="Book Antiqua"/>
+                <w:sz w:val="20"/>
+                <w:szCs w:val="20"/>
+              </w:rPr>
+            </w:pPr>
+          </w:p>
+        </w:tc>
+        <w:tc>
+          <w:tcPr>
+            <w:tcW w:w="4179" w:type="dxa"/>
+          </w:tcPr>
+          <w:p>
+            <w:pPr>
+              <w:pStyle w:val="Header"/>
+              <w:rPr>
+                <w:rFonts w:ascii="Book Antiqua" w:hAnsi="Book Antiqua"/>
+                <w:sz w:val="20"/>
+                <w:szCs w:val="20"/>
+              </w:rPr>
+            </w:pPr>
+            <w:r>
+              <w:rPr>
+                <w:rFonts w:ascii="Book Antiqua" w:hAnsi="Book Antiqua"/>
+                <w:sz w:val="20"/>
+                <w:szCs w:val="20"/>
+              </w:rPr>
+              <w:t xml:space="preserve">(Secondary change) </w:t>
+            </w:r>
+            <w:r>
+              <w:rPr>
+                <w:rFonts w:ascii="Book Antiqua" w:hAnsi="Book Antiqua"/>
+                <w:sz w:val="20"/>
+                <w:szCs w:val="20"/>
+              </w:rPr>
+              <w:t>Line 191 – 192: Change the filename OutputTestTInputDataTable-Exception_$sDateTime$.csv to Exception_$sDateTime$.csv</w:t>
+            </w:r>
+          </w:p>
+        </w:tc>
+        <w:tc>
+          <w:tcPr>
+            <w:tcW w:w="2631" w:type="dxa"/>
+          </w:tcPr>
+          <w:p>
+            <w:pPr>
+              <w:pStyle w:val="Header"/>
+              <w:rPr>
+                <w:rFonts w:ascii="Book Antiqua" w:hAnsi="Book Antiqua"/>
+                <w:sz w:val="20"/>
+                <w:szCs w:val="20"/>
+              </w:rPr>
+            </w:pPr>
+            <w:r>
+              <w:rPr>
+                <w:rFonts w:ascii="Book Antiqua" w:hAnsi="Book Antiqua"/>
+                <w:sz w:val="20"/>
+                <w:szCs w:val="20"/>
+              </w:rPr>
+              <w:t>Exception (csv) file contains the list of excluded EEID and the read Job Indicator, Payroll Status from Job Data and Arrears. These EEIDs are excluded from advancing to the next steps. The previous file name is confusing and is ambiguous.</w:t>
+            </w:r>
+          </w:p>
+          <w:p>
+            <w:pPr>
+              <w:ind w:firstLine="720"/>
+              <w:rPr>
+                <w:rFonts w:ascii="Book Antiqua" w:hAnsi="Book Antiqua"/>
+                <w:sz w:val="20"/>
+                <w:szCs w:val="20"/>
+              </w:rPr>
+            </w:pPr>
+          </w:p>
+          <w:p>
+            <w:pPr>
+              <w:rPr>
+                <w:sz w:val="20"/>
+                <w:szCs w:val="20"/>
+              </w:rPr>
+            </w:pPr>
+          </w:p>
+        </w:tc>
+      </w:tr>
+      <w:tr>
+        <w:tc>
+          <w:tcPr>
+            <w:tcW w:w="625" w:type="dxa"/>
+          </w:tcPr>
+          <w:p>
+            <w:pPr>
+              <w:pStyle w:val="Header"/>
+              <w:rPr>
+                <w:rFonts w:ascii="Book Antiqua" w:hAnsi="Book Antiqua"/>
+                <w:sz w:val="20"/>
+                <w:szCs w:val="20"/>
+              </w:rPr>
+            </w:pPr>
+            <w:r>
+              <w:rPr>
+                <w:rFonts w:ascii="Book Antiqua" w:hAnsi="Book Antiqua"/>
+                <w:sz w:val="20"/>
+                <w:szCs w:val="20"/>
+              </w:rPr>
+              <w:t>2</w:t>
+            </w:r>
+            <w:r>
+              <w:rPr>
+                <w:rFonts w:ascii="Book Antiqua" w:hAnsi="Book Antiqua"/>
+                <w:sz w:val="20"/>
+                <w:szCs w:val="20"/>
+              </w:rPr>
+              <w:t>.0</w:t>
+            </w:r>
+          </w:p>
+        </w:tc>
+        <w:tc>
+          <w:tcPr>
+            <w:tcW w:w="1735" w:type="dxa"/>
+          </w:tcPr>
+          <w:p>
+            <w:pPr>
+              <w:pStyle w:val="Header"/>
+              <w:rPr>
+                <w:rFonts w:ascii="Book Antiqua" w:hAnsi="Book Antiqua"/>
+                <w:sz w:val="20"/>
+                <w:szCs w:val="20"/>
+              </w:rPr>
+            </w:pPr>
+            <w:r>
+              <w:rPr>
+                <w:rFonts w:ascii="Book Antiqua" w:hAnsi="Book Antiqua"/>
+                <w:sz w:val="20"/>
+                <w:szCs w:val="20"/>
+              </w:rPr>
+              <w:t>RFL-2-ProcessTransaction</w:t>
+            </w:r>
+          </w:p>
+        </w:tc>
+        <w:tc>
+          <w:tcPr>
+            <w:tcW w:w="4179" w:type="dxa"/>
+          </w:tcPr>
+          <w:p>
+            <w:pPr>
+              <w:pStyle w:val="Header"/>
+              <w:rPr>
+                <w:rFonts w:ascii="Book Antiqua" w:hAnsi="Book Antiqua"/>
+                <w:sz w:val="20"/>
+                <w:szCs w:val="20"/>
+              </w:rPr>
+            </w:pPr>
+            <w:r>
+              <w:rPr>
+                <w:rFonts w:ascii="Book Antiqua" w:hAnsi="Book Antiqua"/>
+                <w:sz w:val="20"/>
+                <w:szCs w:val="20"/>
+              </w:rPr>
+              <w:t xml:space="preserve">Line 95 - 129 - Added Step 2 - Screen Payroll Status and Job Data in </w:t>
+            </w:r>
+            <w:proofErr w:type="spellStart"/>
+            <w:r>
+              <w:rPr>
+                <w:rFonts w:ascii="Book Antiqua" w:hAnsi="Book Antiqua"/>
+                <w:sz w:val="20"/>
+                <w:szCs w:val="20"/>
+              </w:rPr>
+              <w:t>tInputTable</w:t>
+            </w:r>
+            <w:proofErr w:type="spellEnd"/>
+            <w:r>
+              <w:rPr>
+                <w:rFonts w:ascii="Book Antiqua" w:hAnsi="Book Antiqua"/>
+                <w:sz w:val="20"/>
+                <w:szCs w:val="20"/>
+              </w:rPr>
+              <w:t xml:space="preserve"> data table</w:t>
+            </w:r>
+          </w:p>
+        </w:tc>
+        <w:tc>
+          <w:tcPr>
+            <w:tcW w:w="2631" w:type="dxa"/>
+          </w:tcPr>
+          <w:p>
+            <w:pPr>
+              <w:pStyle w:val="Header"/>
+              <w:rPr>
+                <w:rFonts w:ascii="Book Antiqua" w:hAnsi="Book Antiqua"/>
+                <w:sz w:val="20"/>
+                <w:szCs w:val="20"/>
+              </w:rPr>
+            </w:pPr>
+            <w:r>
+              <w:rPr>
+                <w:rFonts w:ascii="Book Antiqua" w:hAnsi="Book Antiqua"/>
+                <w:sz w:val="20"/>
+                <w:szCs w:val="20"/>
+              </w:rPr>
+              <w:t xml:space="preserve">In this step, the bot iterates through </w:t>
+            </w:r>
+            <w:proofErr w:type="spellStart"/>
+            <w:proofErr w:type="gramStart"/>
+            <w:r>
+              <w:rPr>
+                <w:rFonts w:ascii="Book Antiqua" w:hAnsi="Book Antiqua"/>
+                <w:sz w:val="20"/>
+                <w:szCs w:val="20"/>
+              </w:rPr>
+              <w:t>tInputTable</w:t>
+            </w:r>
+            <w:proofErr w:type="spellEnd"/>
+            <w:proofErr w:type="gramEnd"/>
+            <w:r>
+              <w:rPr>
+                <w:rFonts w:ascii="Book Antiqua" w:hAnsi="Book Antiqua"/>
+                <w:sz w:val="20"/>
+                <w:szCs w:val="20"/>
+              </w:rPr>
+              <w:t xml:space="preserve"> and checks Job Indicator should be “Primary Job”. Rows that do not satisfy the condition are placed in </w:t>
+            </w:r>
+            <w:proofErr w:type="spellStart"/>
+            <w:r>
+              <w:rPr>
+                <w:rFonts w:ascii="Book Antiqua" w:hAnsi="Book Antiqua"/>
+                <w:sz w:val="20"/>
+                <w:szCs w:val="20"/>
+              </w:rPr>
+              <w:t>tExceptionTable</w:t>
+            </w:r>
+            <w:proofErr w:type="spellEnd"/>
+            <w:r>
+              <w:rPr>
+                <w:rFonts w:ascii="Book Antiqua" w:hAnsi="Book Antiqua"/>
+                <w:sz w:val="20"/>
+                <w:szCs w:val="20"/>
+              </w:rPr>
+              <w:t xml:space="preserve"> data table</w:t>
+            </w:r>
+          </w:p>
+        </w:tc>
+      </w:tr>
+      <w:tr>
+        <w:tc>
+          <w:tcPr>
+            <w:tcW w:w="625" w:type="dxa"/>
+          </w:tcPr>
+          <w:p>
+            <w:pPr>
+              <w:pStyle w:val="Header"/>
+              <w:rPr>
+                <w:rFonts w:ascii="Book Antiqua" w:hAnsi="Book Antiqua"/>
+                <w:sz w:val="20"/>
+                <w:szCs w:val="20"/>
+              </w:rPr>
+            </w:pPr>
+            <w:r>
+              <w:rPr>
+                <w:rFonts w:ascii="Book Antiqua" w:hAnsi="Book Antiqua"/>
+                <w:sz w:val="20"/>
+                <w:szCs w:val="20"/>
+              </w:rPr>
+              <w:t>2.1</w:t>
+            </w:r>
+          </w:p>
+        </w:tc>
+        <w:tc>
+          <w:tcPr>
+            <w:tcW w:w="1735" w:type="dxa"/>
+          </w:tcPr>
+          <w:p>
+            <w:pPr>
+              <w:pStyle w:val="Header"/>
+              <w:rPr>
+                <w:rFonts w:ascii="Book Antiqua" w:hAnsi="Book Antiqua"/>
+                <w:sz w:val="20"/>
+                <w:szCs w:val="20"/>
+              </w:rPr>
+            </w:pPr>
+          </w:p>
+        </w:tc>
+        <w:tc>
+          <w:tcPr>
+            <w:tcW w:w="4179" w:type="dxa"/>
+          </w:tcPr>
+          <w:p>
+            <w:pPr>
+              <w:pStyle w:val="Header"/>
+              <w:rPr>
+                <w:rFonts w:ascii="Book Antiqua" w:hAnsi="Book Antiqua"/>
+                <w:sz w:val="20"/>
+                <w:szCs w:val="20"/>
+              </w:rPr>
+            </w:pPr>
+            <w:r>
+              <w:rPr>
+                <w:rFonts w:ascii="Book Antiqua" w:hAnsi="Book Antiqua"/>
+                <w:sz w:val="20"/>
+                <w:szCs w:val="20"/>
+              </w:rPr>
+              <w:t xml:space="preserve">Line 130 - 134 - Added Step 3 - Close all </w:t>
+            </w:r>
+            <w:proofErr w:type="gramStart"/>
+            <w:r>
+              <w:rPr>
+                <w:rFonts w:ascii="Book Antiqua" w:hAnsi="Book Antiqua"/>
+                <w:sz w:val="20"/>
+                <w:szCs w:val="20"/>
+              </w:rPr>
+              <w:t>browser</w:t>
+            </w:r>
+            <w:proofErr w:type="gramEnd"/>
+            <w:r>
+              <w:rPr>
+                <w:rFonts w:ascii="Book Antiqua" w:hAnsi="Book Antiqua"/>
+                <w:sz w:val="20"/>
+                <w:szCs w:val="20"/>
+              </w:rPr>
+              <w:t xml:space="preserve"> and write to CSV</w:t>
+            </w:r>
+          </w:p>
+        </w:tc>
+        <w:tc>
+          <w:tcPr>
+            <w:tcW w:w="2631" w:type="dxa"/>
+          </w:tcPr>
+          <w:p>
+            <w:pPr>
+              <w:pStyle w:val="Header"/>
+              <w:rPr>
+                <w:rFonts w:ascii="Book Antiqua" w:hAnsi="Book Antiqua"/>
+                <w:sz w:val="20"/>
+                <w:szCs w:val="20"/>
+              </w:rPr>
+            </w:pPr>
+            <w:r>
+              <w:rPr>
+                <w:rFonts w:ascii="Book Antiqua" w:hAnsi="Book Antiqua"/>
+                <w:sz w:val="20"/>
+                <w:szCs w:val="20"/>
+              </w:rPr>
+              <w:t xml:space="preserve">In this step, the bot closes all browser and write both </w:t>
+            </w:r>
+            <w:proofErr w:type="spellStart"/>
+            <w:r>
+              <w:rPr>
+                <w:rFonts w:ascii="Book Antiqua" w:hAnsi="Book Antiqua"/>
+                <w:sz w:val="20"/>
+                <w:szCs w:val="20"/>
+              </w:rPr>
+              <w:t>tInputTable</w:t>
+            </w:r>
+            <w:proofErr w:type="spellEnd"/>
+            <w:r>
+              <w:rPr>
+                <w:rFonts w:ascii="Book Antiqua" w:hAnsi="Book Antiqua"/>
+                <w:sz w:val="20"/>
+                <w:szCs w:val="20"/>
+              </w:rPr>
+              <w:t xml:space="preserve"> and </w:t>
+            </w:r>
+            <w:proofErr w:type="spellStart"/>
+            <w:r>
+              <w:rPr>
+                <w:rFonts w:ascii="Book Antiqua" w:hAnsi="Book Antiqua"/>
+                <w:sz w:val="20"/>
+                <w:szCs w:val="20"/>
+              </w:rPr>
+              <w:t>tExceptionTable</w:t>
+            </w:r>
+            <w:proofErr w:type="spellEnd"/>
+            <w:r>
+              <w:rPr>
+                <w:rFonts w:ascii="Book Antiqua" w:hAnsi="Book Antiqua"/>
+                <w:sz w:val="20"/>
+                <w:szCs w:val="20"/>
+              </w:rPr>
+              <w:t xml:space="preserve"> to </w:t>
+            </w:r>
+            <w:proofErr w:type="spellStart"/>
+            <w:r>
+              <w:rPr>
+                <w:rFonts w:ascii="Book Antiqua" w:hAnsi="Book Antiqua"/>
+                <w:sz w:val="20"/>
+                <w:szCs w:val="20"/>
+              </w:rPr>
+              <w:t>List_of_Recon_Ready_EEI</w:t>
+            </w:r>
+            <w:r>
+              <w:rPr>
+                <w:rFonts w:ascii="Book Antiqua" w:hAnsi="Book Antiqua"/>
+                <w:sz w:val="20"/>
+                <w:szCs w:val="20"/>
+              </w:rPr>
+              <w:lastRenderedPageBreak/>
+              <w:t>D</w:t>
+            </w:r>
+            <w:proofErr w:type="spellEnd"/>
+            <w:r>
+              <w:rPr>
+                <w:rFonts w:ascii="Book Antiqua" w:hAnsi="Book Antiqua"/>
+                <w:sz w:val="20"/>
+                <w:szCs w:val="20"/>
+              </w:rPr>
+              <w:t xml:space="preserve"> (csv) file and Exception (csv) file</w:t>
+            </w:r>
+          </w:p>
+        </w:tc>
+      </w:tr>
+      <w:tr>
+        <w:tc>
+          <w:tcPr>
+            <w:tcW w:w="625" w:type="dxa"/>
+          </w:tcPr>
+          <w:p>
+            <w:pPr>
+              <w:pStyle w:val="Header"/>
+              <w:rPr>
+                <w:rFonts w:ascii="Book Antiqua" w:hAnsi="Book Antiqua"/>
+                <w:sz w:val="20"/>
+                <w:szCs w:val="20"/>
+              </w:rPr>
+            </w:pPr>
+            <w:r>
+              <w:rPr>
+                <w:rFonts w:ascii="Book Antiqua" w:hAnsi="Book Antiqua"/>
+                <w:sz w:val="20"/>
+                <w:szCs w:val="20"/>
+              </w:rPr>
+              <w:lastRenderedPageBreak/>
+              <w:t>2.2</w:t>
+            </w:r>
+          </w:p>
+        </w:tc>
+        <w:tc>
+          <w:tcPr>
+            <w:tcW w:w="1735" w:type="dxa"/>
+          </w:tcPr>
+          <w:p>
+            <w:pPr>
+              <w:pStyle w:val="Header"/>
+              <w:rPr>
+                <w:rFonts w:ascii="Book Antiqua" w:hAnsi="Book Antiqua"/>
+                <w:sz w:val="20"/>
+                <w:szCs w:val="20"/>
+              </w:rPr>
+            </w:pPr>
+          </w:p>
+        </w:tc>
+        <w:tc>
+          <w:tcPr>
+            <w:tcW w:w="4179" w:type="dxa"/>
+          </w:tcPr>
+          <w:p>
+            <w:pPr>
+              <w:pStyle w:val="Header"/>
+              <w:rPr>
+                <w:rFonts w:ascii="Book Antiqua" w:hAnsi="Book Antiqua"/>
+                <w:sz w:val="20"/>
+                <w:szCs w:val="20"/>
+              </w:rPr>
+            </w:pPr>
+            <w:r>
+              <w:rPr>
+                <w:rFonts w:ascii="Book Antiqua" w:hAnsi="Book Antiqua"/>
+                <w:sz w:val="20"/>
+                <w:szCs w:val="20"/>
+              </w:rPr>
+              <w:t xml:space="preserve">Line 54 – updated and added condition </w:t>
+            </w:r>
+            <w:r>
+              <w:rPr>
+                <w:rFonts w:ascii="Book Antiqua" w:hAnsi="Book Antiqua"/>
+                <w:b/>
+                <w:bCs/>
+                <w:sz w:val="20"/>
+                <w:szCs w:val="20"/>
+              </w:rPr>
+              <w:t>“…</w:t>
+            </w:r>
+            <w:r>
+              <w:rPr>
+                <w:rFonts w:ascii="Book Antiqua" w:hAnsi="Book Antiqua"/>
+                <w:sz w:val="20"/>
+                <w:szCs w:val="20"/>
+              </w:rPr>
+              <w:t> and </w:t>
+            </w:r>
+            <w:proofErr w:type="gramStart"/>
+            <w:r>
+              <w:rPr>
+                <w:rFonts w:ascii="Book Antiqua" w:hAnsi="Book Antiqua"/>
+                <w:sz w:val="20"/>
+                <w:szCs w:val="20"/>
+              </w:rPr>
+              <w:t>( “</w:t>
+            </w:r>
+            <w:proofErr w:type="gramEnd"/>
+            <w:r>
+              <w:rPr>
+                <w:rFonts w:ascii="Book Antiqua" w:hAnsi="Book Antiqua"/>
+                <w:b/>
+                <w:bCs/>
+                <w:sz w:val="20"/>
+                <w:szCs w:val="20"/>
+              </w:rPr>
+              <w:t>BUTTON</w:t>
+            </w:r>
+            <w:r>
+              <w:rPr>
+                <w:rFonts w:ascii="Book Antiqua" w:hAnsi="Book Antiqua"/>
+                <w:sz w:val="20"/>
+                <w:szCs w:val="20"/>
+              </w:rPr>
+              <w:t>” in window </w:t>
+            </w:r>
+            <w:r>
+              <w:rPr>
+                <w:rFonts w:ascii="Book Antiqua" w:hAnsi="Book Antiqua"/>
+                <w:b/>
+                <w:bCs/>
+                <w:sz w:val="20"/>
+                <w:szCs w:val="20"/>
+              </w:rPr>
+              <w:t>$Browser3$</w:t>
+            </w:r>
+            <w:r>
+              <w:rPr>
+                <w:rFonts w:ascii="Book Antiqua" w:hAnsi="Book Antiqua"/>
+                <w:sz w:val="20"/>
+                <w:szCs w:val="20"/>
+              </w:rPr>
+              <w:t xml:space="preserve"> does not </w:t>
+            </w:r>
+            <w:proofErr w:type="gramStart"/>
+            <w:r>
+              <w:rPr>
+                <w:rFonts w:ascii="Book Antiqua" w:hAnsi="Book Antiqua"/>
+                <w:sz w:val="20"/>
+                <w:szCs w:val="20"/>
+              </w:rPr>
+              <w:t>exist )</w:t>
+            </w:r>
+            <w:proofErr w:type="gramEnd"/>
+            <w:r>
+              <w:rPr>
+                <w:rFonts w:ascii="Book Antiqua" w:hAnsi="Book Antiqua"/>
+                <w:sz w:val="20"/>
+                <w:szCs w:val="20"/>
+              </w:rPr>
+              <w:t>” in If condition</w:t>
+            </w:r>
+          </w:p>
+          <w:p>
+            <w:pPr>
+              <w:pStyle w:val="Header"/>
+              <w:rPr>
+                <w:rFonts w:ascii="Book Antiqua" w:hAnsi="Book Antiqua"/>
+                <w:sz w:val="20"/>
+                <w:szCs w:val="20"/>
+              </w:rPr>
+            </w:pPr>
+          </w:p>
+        </w:tc>
+        <w:tc>
+          <w:tcPr>
+            <w:tcW w:w="2631" w:type="dxa"/>
+          </w:tcPr>
+          <w:p>
+            <w:pPr>
+              <w:pStyle w:val="Header"/>
+              <w:rPr>
+                <w:rFonts w:ascii="Book Antiqua" w:hAnsi="Book Antiqua"/>
+                <w:sz w:val="20"/>
+                <w:szCs w:val="20"/>
+              </w:rPr>
+            </w:pPr>
+            <w:r>
+              <w:rPr>
+                <w:rFonts w:ascii="Book Antiqua" w:hAnsi="Book Antiqua"/>
+                <w:sz w:val="20"/>
+                <w:szCs w:val="20"/>
+              </w:rPr>
+              <w:t>Adding this condition will account for the case where Job Indicator is not Primary Job and when the is no more Job Data record in the list.</w:t>
+            </w:r>
+          </w:p>
+        </w:tc>
+      </w:tr>
+      <w:tr>
+        <w:tc>
+          <w:tcPr>
+            <w:tcW w:w="625" w:type="dxa"/>
+          </w:tcPr>
+          <w:p>
+            <w:pPr>
+              <w:pStyle w:val="Header"/>
+              <w:rPr>
+                <w:rFonts w:ascii="Book Antiqua" w:hAnsi="Book Antiqua"/>
+                <w:sz w:val="20"/>
+                <w:szCs w:val="20"/>
+              </w:rPr>
+            </w:pPr>
+            <w:r>
+              <w:rPr>
+                <w:rFonts w:ascii="Book Antiqua" w:hAnsi="Book Antiqua"/>
+                <w:sz w:val="20"/>
+                <w:szCs w:val="20"/>
+              </w:rPr>
+              <w:t>3.0</w:t>
+            </w:r>
+          </w:p>
+        </w:tc>
+        <w:tc>
+          <w:tcPr>
+            <w:tcW w:w="1735" w:type="dxa"/>
+          </w:tcPr>
+          <w:p>
+            <w:pPr>
+              <w:pStyle w:val="Header"/>
+              <w:rPr>
+                <w:rFonts w:ascii="Book Antiqua" w:hAnsi="Book Antiqua"/>
+                <w:sz w:val="20"/>
+                <w:szCs w:val="20"/>
+              </w:rPr>
+            </w:pPr>
+            <w:r>
+              <w:rPr>
+                <w:rFonts w:ascii="Book Antiqua" w:hAnsi="Book Antiqua"/>
+                <w:sz w:val="20"/>
+                <w:szCs w:val="20"/>
+              </w:rPr>
+              <w:t>RFL-6A-OCF-TRA</w:t>
+            </w:r>
+          </w:p>
+        </w:tc>
+        <w:tc>
+          <w:tcPr>
+            <w:tcW w:w="4179" w:type="dxa"/>
+          </w:tcPr>
+          <w:p>
+            <w:pPr>
+              <w:pStyle w:val="Header"/>
+              <w:rPr>
+                <w:rFonts w:ascii="Book Antiqua" w:hAnsi="Book Antiqua"/>
+                <w:sz w:val="20"/>
+                <w:szCs w:val="20"/>
+              </w:rPr>
+            </w:pPr>
+            <w:r>
+              <w:rPr>
+                <w:rFonts w:ascii="Book Antiqua" w:hAnsi="Book Antiqua"/>
+                <w:sz w:val="20"/>
+                <w:szCs w:val="20"/>
+              </w:rPr>
+              <w:t xml:space="preserve">(Secondary change) </w:t>
+            </w:r>
+            <w:r>
+              <w:rPr>
+                <w:rFonts w:ascii="Book Antiqua" w:hAnsi="Book Antiqua"/>
+                <w:sz w:val="20"/>
+                <w:szCs w:val="20"/>
+              </w:rPr>
+              <w:t>Line 45 - 48 - added click Reset &gt; Clear All</w:t>
+            </w:r>
+          </w:p>
+        </w:tc>
+        <w:tc>
+          <w:tcPr>
+            <w:tcW w:w="2631" w:type="dxa"/>
+          </w:tcPr>
+          <w:p>
+            <w:pPr>
+              <w:pStyle w:val="Header"/>
+              <w:rPr>
+                <w:rFonts w:ascii="Book Antiqua" w:hAnsi="Book Antiqua"/>
+                <w:sz w:val="20"/>
+                <w:szCs w:val="20"/>
+              </w:rPr>
+            </w:pPr>
+            <w:r>
+              <w:rPr>
+                <w:rFonts w:ascii="Book Antiqua" w:hAnsi="Book Antiqua"/>
+                <w:sz w:val="20"/>
+                <w:szCs w:val="20"/>
+              </w:rPr>
+              <w:t xml:space="preserve">Bot to click Reset &gt; Clear All at the start of every iteration </w:t>
+            </w:r>
+            <w:proofErr w:type="gramStart"/>
+            <w:r>
+              <w:rPr>
+                <w:rFonts w:ascii="Book Antiqua" w:hAnsi="Book Antiqua"/>
+                <w:sz w:val="20"/>
+                <w:szCs w:val="20"/>
+              </w:rPr>
+              <w:t>in order to</w:t>
+            </w:r>
+            <w:proofErr w:type="gramEnd"/>
+            <w:r>
+              <w:rPr>
+                <w:rFonts w:ascii="Book Antiqua" w:hAnsi="Book Antiqua"/>
+                <w:sz w:val="20"/>
+                <w:szCs w:val="20"/>
+              </w:rPr>
+              <w:t xml:space="preserve"> clear any residual value from previous iteration.</w:t>
+            </w:r>
+          </w:p>
+        </w:tc>
+      </w:tr>
+      <w:tr>
+        <w:tc>
+          <w:tcPr>
+            <w:tcW w:w="625" w:type="dxa"/>
+          </w:tcPr>
+          <w:p>
+            <w:pPr>
+              <w:pStyle w:val="Header"/>
+              <w:rPr>
+                <w:rFonts w:ascii="Book Antiqua" w:hAnsi="Book Antiqua"/>
+                <w:sz w:val="20"/>
+                <w:szCs w:val="20"/>
+              </w:rPr>
+            </w:pPr>
+            <w:r>
+              <w:rPr>
+                <w:rFonts w:ascii="Book Antiqua" w:hAnsi="Book Antiqua"/>
+                <w:sz w:val="20"/>
+                <w:szCs w:val="20"/>
+              </w:rPr>
+              <w:t>3.1</w:t>
+            </w:r>
+          </w:p>
+        </w:tc>
+        <w:tc>
+          <w:tcPr>
+            <w:tcW w:w="1735" w:type="dxa"/>
+          </w:tcPr>
+          <w:p>
+            <w:pPr>
+              <w:pStyle w:val="Header"/>
+              <w:rPr>
+                <w:rFonts w:ascii="Book Antiqua" w:hAnsi="Book Antiqua"/>
+                <w:sz w:val="20"/>
+                <w:szCs w:val="20"/>
+              </w:rPr>
+            </w:pPr>
+          </w:p>
+        </w:tc>
+        <w:tc>
+          <w:tcPr>
+            <w:tcW w:w="4179" w:type="dxa"/>
+          </w:tcPr>
+          <w:p>
+            <w:pPr>
+              <w:pStyle w:val="Header"/>
+              <w:rPr>
+                <w:rFonts w:ascii="Book Antiqua" w:hAnsi="Book Antiqua"/>
+                <w:sz w:val="20"/>
+                <w:szCs w:val="20"/>
+              </w:rPr>
+            </w:pPr>
+            <w:r>
+              <w:rPr>
+                <w:rFonts w:ascii="Book Antiqua" w:hAnsi="Book Antiqua"/>
+                <w:sz w:val="20"/>
+                <w:szCs w:val="20"/>
+              </w:rPr>
+              <w:t>(Secondary change)</w:t>
+            </w:r>
+            <w:r>
+              <w:t xml:space="preserve"> </w:t>
+            </w:r>
+            <w:r>
+              <w:rPr>
+                <w:rFonts w:ascii="Book Antiqua" w:hAnsi="Book Antiqua"/>
+                <w:sz w:val="20"/>
+                <w:szCs w:val="20"/>
+              </w:rPr>
+              <w:t>Line 79 - Uncheck resize window when clicking Save button in file dialog</w:t>
+            </w:r>
+          </w:p>
+        </w:tc>
+        <w:tc>
+          <w:tcPr>
+            <w:tcW w:w="2631" w:type="dxa"/>
+          </w:tcPr>
+          <w:p>
+            <w:pPr>
+              <w:pStyle w:val="Header"/>
+              <w:rPr>
+                <w:rFonts w:ascii="Book Antiqua" w:hAnsi="Book Antiqua"/>
+                <w:sz w:val="20"/>
+                <w:szCs w:val="20"/>
+              </w:rPr>
+            </w:pPr>
+            <w:proofErr w:type="gramStart"/>
+            <w:r>
+              <w:rPr>
+                <w:rFonts w:ascii="Book Antiqua" w:hAnsi="Book Antiqua"/>
+                <w:sz w:val="20"/>
+                <w:szCs w:val="20"/>
+              </w:rPr>
+              <w:t>this</w:t>
+            </w:r>
+            <w:proofErr w:type="gramEnd"/>
+            <w:r>
+              <w:rPr>
+                <w:rFonts w:ascii="Book Antiqua" w:hAnsi="Book Antiqua"/>
+                <w:sz w:val="20"/>
+                <w:szCs w:val="20"/>
+              </w:rPr>
+              <w:t xml:space="preserve"> is done so that the bot can find the Save button in file dialog</w:t>
+            </w:r>
+          </w:p>
+        </w:tc>
+      </w:tr>
+      <w:tr>
+        <w:tc>
+          <w:tcPr>
+            <w:tcW w:w="625" w:type="dxa"/>
+          </w:tcPr>
+          <w:p>
+            <w:pPr>
+              <w:pStyle w:val="Header"/>
+              <w:rPr>
+                <w:rFonts w:ascii="Book Antiqua" w:hAnsi="Book Antiqua"/>
+                <w:sz w:val="20"/>
+                <w:szCs w:val="20"/>
+              </w:rPr>
+            </w:pPr>
+            <w:r>
+              <w:rPr>
+                <w:rFonts w:ascii="Book Antiqua" w:hAnsi="Book Antiqua"/>
+                <w:sz w:val="20"/>
+                <w:szCs w:val="20"/>
+              </w:rPr>
+              <w:t>3.2</w:t>
+            </w:r>
+          </w:p>
+        </w:tc>
+        <w:tc>
+          <w:tcPr>
+            <w:tcW w:w="1735" w:type="dxa"/>
+          </w:tcPr>
+          <w:p>
+            <w:pPr>
+              <w:pStyle w:val="Header"/>
+              <w:rPr>
+                <w:rFonts w:ascii="Book Antiqua" w:hAnsi="Book Antiqua"/>
+                <w:sz w:val="20"/>
+                <w:szCs w:val="20"/>
+              </w:rPr>
+            </w:pPr>
+          </w:p>
+        </w:tc>
+        <w:tc>
+          <w:tcPr>
+            <w:tcW w:w="4179" w:type="dxa"/>
+          </w:tcPr>
+          <w:p>
+            <w:pPr>
+              <w:pStyle w:val="Header"/>
+              <w:rPr>
+                <w:rFonts w:ascii="Book Antiqua" w:hAnsi="Book Antiqua"/>
+                <w:sz w:val="20"/>
+                <w:szCs w:val="20"/>
+              </w:rPr>
+            </w:pPr>
+            <w:r>
+              <w:rPr>
+                <w:rFonts w:ascii="Book Antiqua" w:hAnsi="Book Antiqua"/>
+                <w:sz w:val="20"/>
+                <w:szCs w:val="20"/>
+              </w:rPr>
+              <w:t>(Secondary change)</w:t>
+            </w:r>
+            <w:r>
+              <w:t xml:space="preserve"> </w:t>
+            </w:r>
+            <w:r>
+              <w:rPr>
+                <w:rFonts w:ascii="Book Antiqua" w:hAnsi="Book Antiqua"/>
+                <w:sz w:val="20"/>
+                <w:szCs w:val="20"/>
+              </w:rPr>
+              <w:t>Line 99 - Add Browser: Close Tab inside Error handler: Catch</w:t>
+            </w:r>
+          </w:p>
+        </w:tc>
+        <w:tc>
+          <w:tcPr>
+            <w:tcW w:w="2631" w:type="dxa"/>
+          </w:tcPr>
+          <w:p>
+            <w:pPr>
+              <w:pStyle w:val="Header"/>
+              <w:rPr>
+                <w:rFonts w:ascii="Book Antiqua" w:hAnsi="Book Antiqua"/>
+                <w:sz w:val="20"/>
+                <w:szCs w:val="20"/>
+              </w:rPr>
+            </w:pPr>
+            <w:proofErr w:type="gramStart"/>
+            <w:r>
+              <w:rPr>
+                <w:rFonts w:ascii="Book Antiqua" w:hAnsi="Book Antiqua"/>
+                <w:sz w:val="20"/>
+                <w:szCs w:val="20"/>
+              </w:rPr>
+              <w:t>this</w:t>
+            </w:r>
+            <w:proofErr w:type="gramEnd"/>
+            <w:r>
+              <w:rPr>
+                <w:rFonts w:ascii="Book Antiqua" w:hAnsi="Book Antiqua"/>
+                <w:sz w:val="20"/>
+                <w:szCs w:val="20"/>
+              </w:rPr>
+              <w:t xml:space="preserve"> is to close the browser tab if bot encounters an error during saving of the file</w:t>
+            </w:r>
+          </w:p>
+        </w:tc>
+      </w:tr>
+      <w:tr>
+        <w:tc>
+          <w:tcPr>
+            <w:tcW w:w="625" w:type="dxa"/>
+          </w:tcPr>
+          <w:p>
+            <w:pPr>
+              <w:pStyle w:val="Header"/>
+              <w:rPr>
+                <w:rFonts w:ascii="Book Antiqua" w:hAnsi="Book Antiqua"/>
+                <w:sz w:val="20"/>
+                <w:szCs w:val="20"/>
+              </w:rPr>
+            </w:pPr>
+            <w:r>
+              <w:rPr>
+                <w:rFonts w:ascii="Book Antiqua" w:hAnsi="Book Antiqua"/>
+                <w:sz w:val="20"/>
+                <w:szCs w:val="20"/>
+              </w:rPr>
+              <w:t>4.0</w:t>
+            </w:r>
+          </w:p>
+        </w:tc>
+        <w:tc>
+          <w:tcPr>
+            <w:tcW w:w="1735" w:type="dxa"/>
+          </w:tcPr>
+          <w:p>
+            <w:pPr>
+              <w:pStyle w:val="Header"/>
+              <w:rPr>
+                <w:rFonts w:ascii="Book Antiqua" w:hAnsi="Book Antiqua"/>
+                <w:sz w:val="20"/>
+                <w:szCs w:val="20"/>
+              </w:rPr>
+            </w:pPr>
+            <w:r>
+              <w:rPr>
+                <w:rFonts w:ascii="Book Antiqua" w:hAnsi="Book Antiqua"/>
+                <w:sz w:val="20"/>
+                <w:szCs w:val="20"/>
+              </w:rPr>
+              <w:t>1.0_Main</w:t>
+            </w:r>
+          </w:p>
+        </w:tc>
+        <w:tc>
+          <w:tcPr>
+            <w:tcW w:w="4179" w:type="dxa"/>
+          </w:tcPr>
+          <w:p>
+            <w:pPr>
+              <w:pStyle w:val="Header"/>
+              <w:rPr>
+                <w:rFonts w:ascii="Book Antiqua" w:hAnsi="Book Antiqua"/>
+                <w:sz w:val="20"/>
+                <w:szCs w:val="20"/>
+              </w:rPr>
+            </w:pPr>
+            <w:r>
+              <w:rPr>
+                <w:rFonts w:ascii="Book Antiqua" w:hAnsi="Book Antiqua"/>
+                <w:sz w:val="20"/>
+                <w:szCs w:val="20"/>
+              </w:rPr>
+              <w:t xml:space="preserve">Line 22 - disable Task </w:t>
+            </w:r>
+            <w:proofErr w:type="gramStart"/>
+            <w:r>
+              <w:rPr>
+                <w:rFonts w:ascii="Book Antiqua" w:hAnsi="Book Antiqua"/>
+                <w:sz w:val="20"/>
+                <w:szCs w:val="20"/>
+              </w:rPr>
+              <w:t>Bot :</w:t>
+            </w:r>
+            <w:proofErr w:type="gramEnd"/>
+            <w:r>
+              <w:rPr>
+                <w:rFonts w:ascii="Book Antiqua" w:hAnsi="Book Antiqua"/>
+                <w:sz w:val="20"/>
+                <w:szCs w:val="20"/>
+              </w:rPr>
+              <w:t xml:space="preserve"> Run RFL-3-CheckArrears</w:t>
+            </w:r>
+          </w:p>
+        </w:tc>
+        <w:tc>
+          <w:tcPr>
+            <w:tcW w:w="2631" w:type="dxa"/>
+          </w:tcPr>
+          <w:p>
+            <w:pPr>
+              <w:pStyle w:val="Header"/>
+              <w:rPr>
+                <w:rFonts w:ascii="Book Antiqua" w:hAnsi="Book Antiqua"/>
+                <w:sz w:val="20"/>
+                <w:szCs w:val="20"/>
+              </w:rPr>
+            </w:pPr>
+            <w:r>
+              <w:rPr>
+                <w:rFonts w:ascii="Book Antiqua" w:hAnsi="Book Antiqua"/>
+                <w:sz w:val="20"/>
+                <w:szCs w:val="20"/>
+              </w:rPr>
+              <w:t xml:space="preserve">RFL-3-CheckArrears task bot is </w:t>
+            </w:r>
+            <w:r>
+              <w:rPr>
+                <w:rFonts w:ascii="Book Antiqua" w:hAnsi="Book Antiqua"/>
+                <w:sz w:val="20"/>
+                <w:szCs w:val="20"/>
+              </w:rPr>
+              <w:t xml:space="preserve">temporarily </w:t>
+            </w:r>
+            <w:r>
+              <w:rPr>
+                <w:rFonts w:ascii="Book Antiqua" w:hAnsi="Book Antiqua"/>
+                <w:sz w:val="20"/>
+                <w:szCs w:val="20"/>
+              </w:rPr>
+              <w:t>disabled therefore there is no need to run it</w:t>
+            </w:r>
+          </w:p>
+        </w:tc>
+      </w:tr>
+      <w:tr>
+        <w:tc>
+          <w:tcPr>
+            <w:tcW w:w="625" w:type="dxa"/>
+          </w:tcPr>
+          <w:p>
+            <w:pPr>
+              <w:pStyle w:val="Header"/>
+              <w:rPr>
+                <w:rFonts w:ascii="Book Antiqua" w:hAnsi="Book Antiqua"/>
+                <w:sz w:val="20"/>
+                <w:szCs w:val="20"/>
+              </w:rPr>
+            </w:pPr>
+            <w:r>
+              <w:rPr>
+                <w:rFonts w:ascii="Book Antiqua" w:hAnsi="Book Antiqua"/>
+                <w:sz w:val="20"/>
+                <w:szCs w:val="20"/>
+              </w:rPr>
+              <w:t>4.1</w:t>
+            </w:r>
+          </w:p>
+        </w:tc>
+        <w:tc>
+          <w:tcPr>
+            <w:tcW w:w="1735" w:type="dxa"/>
+          </w:tcPr>
+          <w:p>
+            <w:pPr>
+              <w:pStyle w:val="Header"/>
+              <w:rPr>
+                <w:rFonts w:ascii="Book Antiqua" w:hAnsi="Book Antiqua"/>
+                <w:sz w:val="20"/>
+                <w:szCs w:val="20"/>
+              </w:rPr>
+            </w:pPr>
+          </w:p>
+        </w:tc>
+        <w:tc>
+          <w:tcPr>
+            <w:tcW w:w="4179" w:type="dxa"/>
+          </w:tcPr>
+          <w:p>
+            <w:pPr>
+              <w:pStyle w:val="Header"/>
+              <w:rPr>
+                <w:rFonts w:ascii="Book Antiqua" w:hAnsi="Book Antiqua"/>
+                <w:sz w:val="20"/>
+                <w:szCs w:val="20"/>
+              </w:rPr>
+            </w:pPr>
+            <w:r>
+              <w:rPr>
+                <w:rFonts w:ascii="Book Antiqua" w:hAnsi="Book Antiqua"/>
+                <w:sz w:val="20"/>
+                <w:szCs w:val="20"/>
+              </w:rPr>
+              <w:t xml:space="preserve">(Secondary change) </w:t>
+            </w:r>
+            <w:r>
+              <w:rPr>
+                <w:rFonts w:ascii="Book Antiqua" w:hAnsi="Book Antiqua"/>
+                <w:sz w:val="20"/>
+                <w:szCs w:val="20"/>
+              </w:rPr>
+              <w:t xml:space="preserve">Line 23 - Add Task Bot: Run </w:t>
+            </w:r>
+            <w:proofErr w:type="spellStart"/>
+            <w:r>
+              <w:rPr>
+                <w:rFonts w:ascii="Book Antiqua" w:hAnsi="Book Antiqua"/>
+                <w:sz w:val="20"/>
+                <w:szCs w:val="20"/>
+              </w:rPr>
+              <w:t>Utils_Chrome_Clear_Browser_BAT_script</w:t>
+            </w:r>
+            <w:proofErr w:type="spellEnd"/>
+          </w:p>
+        </w:tc>
+        <w:tc>
+          <w:tcPr>
+            <w:tcW w:w="2631" w:type="dxa"/>
+          </w:tcPr>
+          <w:p>
+            <w:pPr>
+              <w:pStyle w:val="Header"/>
+              <w:rPr>
+                <w:rFonts w:ascii="Book Antiqua" w:hAnsi="Book Antiqua"/>
+                <w:sz w:val="20"/>
+                <w:szCs w:val="20"/>
+              </w:rPr>
+            </w:pPr>
+            <w:proofErr w:type="gramStart"/>
+            <w:r>
+              <w:rPr>
+                <w:rFonts w:ascii="Book Antiqua" w:hAnsi="Book Antiqua"/>
+                <w:sz w:val="20"/>
+                <w:szCs w:val="20"/>
+              </w:rPr>
+              <w:t>this</w:t>
+            </w:r>
+            <w:proofErr w:type="gramEnd"/>
+            <w:r>
+              <w:rPr>
+                <w:rFonts w:ascii="Book Antiqua" w:hAnsi="Book Antiqua"/>
+                <w:sz w:val="20"/>
+                <w:szCs w:val="20"/>
+              </w:rPr>
+              <w:t xml:space="preserve"> is to clear browser cache during the run</w:t>
+            </w:r>
+          </w:p>
+        </w:tc>
+      </w:tr>
+    </w:tbl>
+    <w:p>
+      <w:pPr>
+        <w:pStyle w:val="Header"/>
+        <w:ind w:left="180"/>
+        <w:rPr>
+          <w:rFonts w:ascii="Book Antiqua" w:hAnsi="Book Antiqua"/>
+          <w:sz w:val="24"/>
+          <w:szCs w:val="24"/>
+        </w:rPr>
+      </w:pPr>
+    </w:p>
+    <w:p>
+      <w:pPr>
+        <w:pStyle w:val="Header"/>
+        <w:numPr>
+          <w:ilvl w:val="3"/>
+          <w:numId w:val="42"/>
+        </w:numPr>
+        <w:ind w:left="540" w:hanging="360"/>
+        <w:rPr>
+          <w:rFonts w:ascii="Book Antiqua" w:hAnsi="Book Antiqua"/>
+          <w:sz w:val="24"/>
+          <w:szCs w:val="24"/>
+        </w:rPr>
+      </w:pPr>
+      <w:r>
+        <w:rPr>
+          <w:rFonts w:ascii="Book Antiqua" w:hAnsi="Book Antiqua"/>
+          <w:sz w:val="24"/>
+          <w:szCs w:val="24"/>
+        </w:rPr>
+        <w:t xml:space="preserve">Changes per </w:t>
+      </w:r>
+      <w:hyperlink r:id="rId59" w:history="1">
+        <w:r>
+          <w:rPr>
+            <w:rStyle w:val="Hyperlink"/>
+            <w:rFonts w:ascii="Book Antiqua" w:hAnsi="Book Antiqua"/>
+            <w:sz w:val="24"/>
+            <w:szCs w:val="24"/>
+          </w:rPr>
+          <w:t>UCP-188507</w:t>
+        </w:r>
+      </w:hyperlink>
+    </w:p>
+    <w:tbl>
+      <w:tblPr>
+        <w:tblStyle w:val="TableGrid"/>
+        <w:tblW w:w="0" w:type="auto"/>
+        <w:tblInd w:w="180" w:type="dxa"/>
+        <w:tblLayout w:type="fixed"/>
+        <w:tblLook w:val="04A0" w:firstRow="1" w:lastRow="0" w:firstColumn="1" w:lastColumn="0" w:noHBand="0" w:noVBand="1"/>
+      </w:tblPr>
+      <w:tblGrid>
+        <w:gridCol w:w="625"/>
+        <w:gridCol w:w="1735"/>
+        <w:gridCol w:w="4179"/>
+        <w:gridCol w:w="2631"/>
+      </w:tblGrid>
+      <w:tr>
+        <w:tc>
+          <w:tcPr>
+            <w:tcW w:w="625" w:type="dxa"/>
+          </w:tcPr>
+          <w:p>
+            <w:pPr>
+              <w:pStyle w:val="Header"/>
+              <w:rPr>
+                <w:rFonts w:ascii="Book Antiqua" w:hAnsi="Book Antiqua"/>
+                <w:sz w:val="20"/>
+                <w:szCs w:val="20"/>
+              </w:rPr>
+            </w:pPr>
+            <w:r>
+              <w:rPr>
+                <w:rFonts w:ascii="Book Antiqua" w:eastAsia="Calibri" w:hAnsi="Book Antiqua"/>
+                <w:sz w:val="20"/>
+                <w:szCs w:val="20"/>
+              </w:rPr>
+              <w:t>No</w:t>
+            </w:r>
+          </w:p>
+        </w:tc>
+        <w:tc>
+          <w:tcPr>
+            <w:tcW w:w="1735" w:type="dxa"/>
+          </w:tcPr>
+          <w:p>
+            <w:pPr>
+              <w:pStyle w:val="Header"/>
+              <w:rPr>
+                <w:rFonts w:ascii="Book Antiqua" w:hAnsi="Book Antiqua"/>
+                <w:sz w:val="20"/>
+                <w:szCs w:val="20"/>
+              </w:rPr>
+            </w:pPr>
+            <w:r>
+              <w:rPr>
+                <w:rFonts w:ascii="Book Antiqua" w:hAnsi="Book Antiqua"/>
+                <w:sz w:val="20"/>
+                <w:szCs w:val="20"/>
+              </w:rPr>
+              <w:t>Task Bot Name</w:t>
+            </w:r>
+          </w:p>
+        </w:tc>
+        <w:tc>
+          <w:tcPr>
+            <w:tcW w:w="4179" w:type="dxa"/>
+          </w:tcPr>
+          <w:p>
+            <w:pPr>
+              <w:pStyle w:val="Header"/>
+              <w:rPr>
+                <w:rFonts w:ascii="Book Antiqua" w:hAnsi="Book Antiqua"/>
+                <w:sz w:val="20"/>
+                <w:szCs w:val="20"/>
+              </w:rPr>
+            </w:pPr>
+            <w:r>
+              <w:rPr>
+                <w:rFonts w:ascii="Book Antiqua" w:hAnsi="Book Antiqua"/>
+                <w:sz w:val="20"/>
+                <w:szCs w:val="20"/>
+              </w:rPr>
+              <w:t>Change Description (what has been changed)</w:t>
+            </w:r>
+          </w:p>
+        </w:tc>
+        <w:tc>
+          <w:tcPr>
+            <w:tcW w:w="2631" w:type="dxa"/>
+          </w:tcPr>
+          <w:p>
+            <w:pPr>
+              <w:pStyle w:val="Header"/>
+              <w:rPr>
+                <w:rFonts w:ascii="Book Antiqua" w:hAnsi="Book Antiqua"/>
+                <w:sz w:val="20"/>
+                <w:szCs w:val="20"/>
+              </w:rPr>
+            </w:pPr>
+            <w:r>
+              <w:rPr>
+                <w:rFonts w:ascii="Book Antiqua" w:hAnsi="Book Antiqua"/>
+                <w:sz w:val="20"/>
+                <w:szCs w:val="20"/>
+              </w:rPr>
+              <w:t>Reason/ Justification</w:t>
+            </w:r>
+          </w:p>
+        </w:tc>
+      </w:tr>
+      <w:tr>
+        <w:tc>
+          <w:tcPr>
+            <w:tcW w:w="625" w:type="dxa"/>
+          </w:tcPr>
+          <w:p>
+            <w:pPr>
+              <w:pStyle w:val="Header"/>
+              <w:rPr>
+                <w:rFonts w:ascii="Book Antiqua" w:hAnsi="Book Antiqua"/>
+                <w:sz w:val="20"/>
+                <w:szCs w:val="20"/>
+              </w:rPr>
+            </w:pPr>
+            <w:r>
+              <w:rPr>
+                <w:rFonts w:ascii="Book Antiqua" w:hAnsi="Book Antiqua"/>
+                <w:sz w:val="20"/>
+                <w:szCs w:val="20"/>
+              </w:rPr>
+              <w:t>1</w:t>
+            </w:r>
+            <w:r>
+              <w:rPr>
+                <w:rFonts w:ascii="Book Antiqua" w:hAnsi="Book Antiqua"/>
+                <w:sz w:val="20"/>
+                <w:szCs w:val="20"/>
+              </w:rPr>
+              <w:t>.0</w:t>
+            </w:r>
+          </w:p>
+        </w:tc>
+        <w:tc>
+          <w:tcPr>
+            <w:tcW w:w="1735" w:type="dxa"/>
+          </w:tcPr>
+          <w:p>
+            <w:pPr>
+              <w:pStyle w:val="Header"/>
+              <w:rPr>
+                <w:rFonts w:ascii="Book Antiqua" w:hAnsi="Book Antiqua"/>
+                <w:sz w:val="20"/>
+                <w:szCs w:val="20"/>
+              </w:rPr>
+            </w:pPr>
+          </w:p>
+          <w:p>
+            <w:pPr>
+              <w:pStyle w:val="Header"/>
+              <w:rPr>
+                <w:rFonts w:ascii="Book Antiqua" w:hAnsi="Book Antiqua"/>
+                <w:sz w:val="20"/>
+                <w:szCs w:val="20"/>
+              </w:rPr>
+            </w:pPr>
+            <w:r>
+              <w:rPr>
+                <w:rFonts w:ascii="Book Antiqua" w:hAnsi="Book Antiqua"/>
+                <w:sz w:val="20"/>
+                <w:szCs w:val="20"/>
+              </w:rPr>
+              <w:t>Config-</w:t>
+            </w:r>
+            <w:proofErr w:type="spellStart"/>
+            <w:r>
+              <w:rPr>
+                <w:rFonts w:ascii="Book Antiqua" w:hAnsi="Book Antiqua"/>
+                <w:sz w:val="20"/>
+                <w:szCs w:val="20"/>
+              </w:rPr>
+              <w:t>RFL.json</w:t>
+            </w:r>
+            <w:proofErr w:type="spellEnd"/>
+          </w:p>
+        </w:tc>
+        <w:tc>
+          <w:tcPr>
+            <w:tcW w:w="4179" w:type="dxa"/>
+          </w:tcPr>
+          <w:p>
+            <w:pPr>
+              <w:pStyle w:val="Header"/>
+              <w:rPr>
+                <w:rFonts w:ascii="Book Antiqua" w:hAnsi="Book Antiqua"/>
+                <w:sz w:val="20"/>
+                <w:szCs w:val="20"/>
+              </w:rPr>
+            </w:pPr>
+            <w:r>
+              <w:rPr>
+                <w:rFonts w:ascii="Book Antiqua" w:hAnsi="Book Antiqua"/>
+                <w:sz w:val="20"/>
+                <w:szCs w:val="20"/>
+              </w:rPr>
+              <w:t xml:space="preserve">Add </w:t>
+            </w:r>
+            <w:hyperlink r:id="rId60" w:history="1">
+              <w:r>
+                <w:rPr>
+                  <w:rStyle w:val="Hyperlink"/>
+                  <w:rFonts w:ascii="Book Antiqua" w:hAnsi="Book Antiqua"/>
+                  <w:sz w:val="20"/>
+                  <w:szCs w:val="20"/>
+                </w:rPr>
+                <w:t>RPA-BusinessSupportTeam@ucop.edu</w:t>
+              </w:r>
+            </w:hyperlink>
+            <w:r>
+              <w:rPr>
+                <w:rFonts w:ascii="Book Antiqua" w:hAnsi="Book Antiqua"/>
+                <w:sz w:val="20"/>
+                <w:szCs w:val="20"/>
+              </w:rPr>
+              <w:t xml:space="preserve"> on Prod node &gt; </w:t>
+            </w:r>
+            <w:proofErr w:type="spellStart"/>
+            <w:r>
+              <w:rPr>
+                <w:rFonts w:ascii="Book Antiqua" w:hAnsi="Book Antiqua"/>
+                <w:sz w:val="20"/>
+                <w:szCs w:val="20"/>
+              </w:rPr>
+              <w:t>ExceptionReportEmailTo</w:t>
+            </w:r>
+            <w:proofErr w:type="spellEnd"/>
+            <w:r>
+              <w:rPr>
+                <w:rFonts w:ascii="Book Antiqua" w:hAnsi="Book Antiqua"/>
+                <w:sz w:val="20"/>
+                <w:szCs w:val="20"/>
+              </w:rPr>
+              <w:t xml:space="preserve"> and </w:t>
+            </w:r>
+            <w:proofErr w:type="spellStart"/>
+            <w:r>
+              <w:rPr>
+                <w:rFonts w:ascii="Book Antiqua" w:hAnsi="Book Antiqua"/>
+                <w:sz w:val="20"/>
+                <w:szCs w:val="20"/>
+              </w:rPr>
+              <w:t>OutputReportEmailTo</w:t>
+            </w:r>
+            <w:proofErr w:type="spellEnd"/>
+          </w:p>
+        </w:tc>
+        <w:tc>
+          <w:tcPr>
+            <w:tcW w:w="2631" w:type="dxa"/>
+          </w:tcPr>
+          <w:p>
+            <w:pPr>
+              <w:pStyle w:val="Header"/>
+              <w:rPr>
+                <w:rFonts w:ascii="Book Antiqua" w:hAnsi="Book Antiqua"/>
+                <w:sz w:val="20"/>
+                <w:szCs w:val="20"/>
+              </w:rPr>
+            </w:pPr>
+            <w:hyperlink r:id="rId61" w:history="1">
+              <w:r>
+                <w:rPr>
+                  <w:rStyle w:val="Hyperlink"/>
+                  <w:rFonts w:ascii="Book Antiqua" w:hAnsi="Book Antiqua"/>
+                  <w:sz w:val="20"/>
+                  <w:szCs w:val="20"/>
+                </w:rPr>
+                <w:t>RPA-BusinessSupportTeam@ucop.edu</w:t>
+              </w:r>
+            </w:hyperlink>
+            <w:r>
+              <w:rPr>
+                <w:rFonts w:ascii="Book Antiqua" w:hAnsi="Book Antiqua"/>
+                <w:sz w:val="20"/>
+                <w:szCs w:val="20"/>
+              </w:rPr>
+              <w:t xml:space="preserve"> is requested to be added as email recipient of all email notifications from AA CR.</w:t>
+            </w:r>
+          </w:p>
+        </w:tc>
+      </w:tr>
+    </w:tbl>
+    <w:p>
+      <w:pPr>
+        <w:pStyle w:val="Header"/>
+        <w:ind w:left="180"/>
         <w:rPr>
           <w:rFonts w:ascii="Book Antiqua" w:hAnsi="Book Antiqua"/>
           <w:sz w:val="24"/>
@@ -19699,7 +23109,7 @@
         <wp:inline distT="0" distB="0" distL="0" distR="0" wp14:anchorId="2EFC87F7" wp14:editId="5830AE48">
           <wp:extent cx="1000125" cy="123825"/>
           <wp:effectExtent l="0" t="0" r="0" b="0"/>
-          <wp:docPr id="611434841" name="Picture 1"/>
+          <wp:docPr id="1291548999" name="Picture 1"/>
           <wp:cNvGraphicFramePr>
             <a:graphicFrameLocks xmlns:a="http://schemas.openxmlformats.org/drawingml/2006/main" noChangeAspect="1"/>
           </wp:cNvGraphicFramePr>
@@ -19785,7 +23195,7 @@
         <wp:inline distT="0" distB="0" distL="0" distR="0" wp14:anchorId="5ABF9B2D" wp14:editId="5E8D6368">
           <wp:extent cx="4773295" cy="804545"/>
           <wp:effectExtent l="0" t="0" r="8255" b="0"/>
-          <wp:docPr id="2093751034" name="Picture 1"/>
+          <wp:docPr id="380050506" name="Picture 1"/>
           <wp:cNvGraphicFramePr>
             <a:graphicFrameLocks xmlns:a="http://schemas.openxmlformats.org/drawingml/2006/main" noChangeAspect="1"/>
           </wp:cNvGraphicFramePr>
@@ -19859,7 +23269,7 @@
           <wp:extent cx="4772025" cy="804545"/>
           <wp:effectExtent l="0" t="0" r="9525" b="0"/>
           <wp:wrapSquare wrapText="right"/>
-          <wp:docPr id="1771373104" name="Picture 1771373104" descr="Graphical user interface&#10;&#10;Description automatically generated"/>
+          <wp:docPr id="1174885028" name="Picture 1174885028" descr="Graphical user interface&#10;&#10;Description automatically generated"/>
           <wp:cNvGraphicFramePr>
             <a:graphicFrameLocks xmlns:a="http://schemas.openxmlformats.org/drawingml/2006/main" noChangeAspect="1"/>
           </wp:cNvGraphicFramePr>
@@ -23879,7 +27289,7 @@
   <w:abstractNum w:abstractNumId="35" w15:restartNumberingAfterBreak="0">
     <w:nsid w:val="54311F5E"/>
     <w:multiLevelType w:val="multilevel"/>
-    <w:tmpl w:val="45400E5A"/>
+    <w:tmpl w:val="920C4706"/>
     <w:lvl w:ilvl="0">
       <w:start w:val="5"/>
       <w:numFmt w:val="lowerLetter"/>
@@ -23916,17 +27326,17 @@
         <w:ind w:left="1980" w:hanging="360"/>
       </w:pPr>
     </w:lvl>
-    <w:lvl w:ilvl="3" w:tentative="1">
-      <w:start w:val="1"/>
-      <w:numFmt w:val="lowerLetter"/>
+    <w:lvl w:ilvl="3">
+      <w:start w:val="1"/>
+      <w:numFmt w:val="upperRoman"/>
       <w:lvlText w:val="%4."/>
       <w:lvlJc w:val="left"/>
       <w:pPr>
-        <w:tabs>
-          <w:tab w:val="num" w:pos="2880"/>
-        </w:tabs>
-        <w:ind w:left="2880" w:hanging="360"/>
-      </w:pPr>
+        <w:ind w:left="3240" w:hanging="720"/>
+      </w:pPr>
+      <w:rPr>
+        <w:rFonts w:hint="default"/>
+      </w:rPr>
     </w:lvl>
     <w:lvl w:ilvl="4" w:tentative="1">
       <w:start w:val="1"/>
@@ -27157,7 +30567,7 @@
   <w:style w:type="paragraph" w:default="1" w:styleId="Normal">
     <w:name w:val="Normal"/>
     <w:qFormat/>
-    <w:rsid w:val="006C6EF3"/>
+    <w:rsid w:val="00A05AD5"/>
     <w:pPr>
       <w:autoSpaceDE w:val="0"/>
       <w:autoSpaceDN w:val="0"/>
@@ -27349,7 +30759,6 @@
   <w:style w:type="character" w:default="1" w:styleId="DefaultParagraphFont">
     <w:name w:val="Default Paragraph Font"/>
     <w:uiPriority w:val="1"/>
-    <w:semiHidden/>
     <w:unhideWhenUsed/>
   </w:style>
   <w:style w:type="table" w:default="1" w:styleId="TableNormal">

</xml_diff>

<commit_message>
FDD updated on 4/23/2026
</commit_message>
<xml_diff>
--- a/Documents/FDD RPA - RFL Reconciliation.docx
+++ b/Documents/FDD RPA - RFL Reconciliation.docx
@@ -580,7 +580,7 @@
           <w:sz w:val="24"/>
           <w:szCs w:val="24"/>
         </w:rPr>
-        <w:t>5</w:t>
+        <w:t>6</w:t>
       </w:r>
     </w:p>
     <w:p>
@@ -1275,13 +1275,7 @@
               <w:rPr>
                 <w:rFonts w:ascii="Book Antiqua" w:hAnsi="Book Antiqua"/>
               </w:rPr>
-              <w:t xml:space="preserve">FDD update based on UCP-184825. </w:t>
-            </w:r>
-            <w:r>
-              <w:rPr>
-                <w:rFonts w:ascii="Book Antiqua" w:hAnsi="Book Antiqua"/>
-              </w:rPr>
-              <w:t>Added Technical Change Note section</w:t>
+              <w:t>FDD update based on UCP-184825. Added Technical Change Note section</w:t>
             </w:r>
           </w:p>
         </w:tc>
@@ -1501,6 +1495,20 @@
                 <w:rFonts w:ascii="Book Antiqua" w:hAnsi="Book Antiqua"/>
               </w:rPr>
             </w:pPr>
+            <w:r>
+              <w:rPr>
+                <w:rStyle w:val="normaltextrun"/>
+                <w:rFonts w:cs="Segoe UI"/>
+              </w:rPr>
+              <w:t>04/22/2026</w:t>
+            </w:r>
+            <w:r>
+              <w:rPr>
+                <w:rStyle w:val="eop"/>
+                <w:rFonts w:ascii="Book Antiqua" w:hAnsi="Book Antiqua" w:cs="Segoe UI"/>
+              </w:rPr>
+              <w:t> </w:t>
+            </w:r>
           </w:p>
         </w:tc>
         <w:tc>
@@ -1515,6 +1523,20 @@
                 <w:color w:val="auto"/>
               </w:rPr>
             </w:pPr>
+            <w:r>
+              <w:rPr>
+                <w:rStyle w:val="normaltextrun"/>
+                <w:rFonts w:cs="Segoe UI"/>
+              </w:rPr>
+              <w:t>Ari Widjaja</w:t>
+            </w:r>
+            <w:r>
+              <w:rPr>
+                <w:rStyle w:val="eop"/>
+                <w:rFonts w:ascii="Book Antiqua" w:hAnsi="Book Antiqua" w:cs="Segoe UI"/>
+              </w:rPr>
+              <w:t> </w:t>
+            </w:r>
           </w:p>
         </w:tc>
         <w:tc>
@@ -1527,6 +1549,20 @@
                 <w:rFonts w:ascii="Book Antiqua" w:hAnsi="Book Antiqua"/>
               </w:rPr>
             </w:pPr>
+            <w:r>
+              <w:rPr>
+                <w:rStyle w:val="normaltextrun"/>
+                <w:rFonts w:cs="Segoe UI"/>
+              </w:rPr>
+              <w:t>1.6</w:t>
+            </w:r>
+            <w:r>
+              <w:rPr>
+                <w:rStyle w:val="eop"/>
+                <w:rFonts w:ascii="Book Antiqua" w:hAnsi="Book Antiqua" w:cs="Segoe UI"/>
+              </w:rPr>
+              <w:t> </w:t>
+            </w:r>
           </w:p>
         </w:tc>
         <w:tc>
@@ -1540,6 +1576,20 @@
                 <w:rFonts w:ascii="Book Antiqua" w:hAnsi="Book Antiqua"/>
               </w:rPr>
             </w:pPr>
+            <w:r>
+              <w:rPr>
+                <w:rStyle w:val="normaltextrun"/>
+                <w:rFonts w:cs="Segoe UI"/>
+              </w:rPr>
+              <w:t>Updated Technical Change Note section on UCP-188100 changes.</w:t>
+            </w:r>
+            <w:r>
+              <w:rPr>
+                <w:rStyle w:val="eop"/>
+                <w:rFonts w:ascii="Book Antiqua" w:hAnsi="Book Antiqua" w:cs="Segoe UI"/>
+              </w:rPr>
+              <w:t> </w:t>
+            </w:r>
           </w:p>
         </w:tc>
       </w:tr>
@@ -15269,7 +15319,25 @@
           <w:sz w:val="22"/>
           <w:szCs w:val="22"/>
         </w:rPr>
-        <w:t xml:space="preserve"> Peoplesoft and navigate to Job Data page. Once login is established and </w:t>
+        <w:t xml:space="preserve"> Peoplesoft and </w:t>
+      </w:r>
+      <w:proofErr w:type="gramStart"/>
+      <w:r>
+        <w:rPr>
+          <w:rFonts w:ascii="Book Antiqua" w:hAnsi="Book Antiqua"/>
+          <w:sz w:val="22"/>
+          <w:szCs w:val="22"/>
+        </w:rPr>
+        <w:t>navigate</w:t>
+      </w:r>
+      <w:proofErr w:type="gramEnd"/>
+      <w:r>
+        <w:rPr>
+          <w:rFonts w:ascii="Book Antiqua" w:hAnsi="Book Antiqua"/>
+          <w:sz w:val="22"/>
+          <w:szCs w:val="22"/>
+        </w:rPr>
+        <w:t xml:space="preserve"> to Job Data page. Once login is established and </w:t>
       </w:r>
       <w:proofErr w:type="gramStart"/>
       <w:r>
@@ -15672,7 +15740,25 @@
           <w:sz w:val="22"/>
           <w:szCs w:val="22"/>
         </w:rPr>
-        <w:t xml:space="preserve">ith Job Indicator equals Primary Job, regardless of Payroll Status will advance to the next processing. Therefore the rules for exception </w:t>
+        <w:t xml:space="preserve">ith Job Indicator equals Primary Job, regardless of Payroll Status will advance to the next processing. Therefore the </w:t>
+      </w:r>
+      <w:proofErr w:type="gramStart"/>
+      <w:r>
+        <w:rPr>
+          <w:rFonts w:ascii="Book Antiqua" w:hAnsi="Book Antiqua"/>
+          <w:sz w:val="22"/>
+          <w:szCs w:val="22"/>
+        </w:rPr>
+        <w:t>rules</w:t>
+      </w:r>
+      <w:proofErr w:type="gramEnd"/>
+      <w:r>
+        <w:rPr>
+          <w:rFonts w:ascii="Book Antiqua" w:hAnsi="Book Antiqua"/>
+          <w:sz w:val="22"/>
+          <w:szCs w:val="22"/>
+        </w:rPr>
+        <w:t xml:space="preserve"> for exception </w:t>
       </w:r>
       <w:proofErr w:type="gramStart"/>
       <w:r>
@@ -16131,7 +16217,7 @@
           <w:szCs w:val="22"/>
           <w:u w:val="single"/>
         </w:rPr>
-        <w:t xml:space="preserve"> </w:t>
+        <w:t xml:space="preserve"> (based on </w:t>
       </w:r>
       <w:r>
         <w:rPr>
@@ -16142,8 +16228,9 @@
           <w:szCs w:val="22"/>
           <w:u w:val="single"/>
         </w:rPr>
-        <w:t xml:space="preserve">(based on </w:t>
-      </w:r>
+        <w:t>UCP-188100</w:t>
+      </w:r>
+      <w:proofErr w:type="gramStart"/>
       <w:r>
         <w:rPr>
           <w:rFonts w:ascii="Book Antiqua" w:hAnsi="Book Antiqua"/>
@@ -16153,18 +16240,6 @@
           <w:szCs w:val="22"/>
           <w:u w:val="single"/>
         </w:rPr>
-        <w:t>UCP-188100</w:t>
-      </w:r>
-      <w:proofErr w:type="gramStart"/>
-      <w:r>
-        <w:rPr>
-          <w:rFonts w:ascii="Book Antiqua" w:hAnsi="Book Antiqua"/>
-          <w:b/>
-          <w:bCs/>
-          <w:sz w:val="22"/>
-          <w:szCs w:val="22"/>
-          <w:u w:val="single"/>
-        </w:rPr>
         <w:t>)</w:t>
       </w:r>
       <w:r>
@@ -16182,15 +16257,7 @@
           <w:sz w:val="22"/>
           <w:szCs w:val="22"/>
         </w:rPr>
-        <w:t xml:space="preserve"> </w:t>
-      </w:r>
-      <w:r>
-        <w:rPr>
-          <w:rFonts w:ascii="Book Antiqua" w:hAnsi="Book Antiqua"/>
-          <w:sz w:val="22"/>
-          <w:szCs w:val="22"/>
-        </w:rPr>
-        <w:t>All accounts regardless of arrear balance will advance to the next processing, therefore arrear balance will not be filtered. Task bot RFL-3-CheckArrears will be disabled.</w:t>
+        <w:t xml:space="preserve"> All accounts regardless of arrear balance will advance to the next processing, therefore arrear balance will not be filtered. Task bot RFL-3-CheckArrears will be disabled.</w:t>
       </w:r>
     </w:p>
     <w:p>
@@ -17555,7 +17622,7 @@
           <w:szCs w:val="22"/>
           <w:u w:val="single"/>
         </w:rPr>
-        <w:t xml:space="preserve"> (based on</w:t>
+        <w:t xml:space="preserve"> (based on </w:t>
       </w:r>
       <w:r>
         <w:rPr>
@@ -17566,8 +17633,9 @@
           <w:szCs w:val="22"/>
           <w:u w:val="single"/>
         </w:rPr>
-        <w:t xml:space="preserve"> </w:t>
-      </w:r>
+        <w:t>UCP-184825</w:t>
+      </w:r>
+      <w:proofErr w:type="gramStart"/>
       <w:r>
         <w:rPr>
           <w:rFonts w:ascii="Book Antiqua" w:hAnsi="Book Antiqua"/>
@@ -17577,18 +17645,6 @@
           <w:szCs w:val="22"/>
           <w:u w:val="single"/>
         </w:rPr>
-        <w:t>UCP-184825</w:t>
-      </w:r>
-      <w:proofErr w:type="gramStart"/>
-      <w:r>
-        <w:rPr>
-          <w:rFonts w:ascii="Book Antiqua" w:hAnsi="Book Antiqua"/>
-          <w:b/>
-          <w:bCs/>
-          <w:sz w:val="22"/>
-          <w:szCs w:val="22"/>
-          <w:u w:val="single"/>
-        </w:rPr>
         <w:t>)</w:t>
       </w:r>
       <w:r>
@@ -17606,15 +17662,7 @@
           <w:sz w:val="22"/>
           <w:szCs w:val="22"/>
         </w:rPr>
-        <w:t xml:space="preserve"> </w:t>
-      </w:r>
-      <w:r>
-        <w:rPr>
-          <w:rFonts w:ascii="Book Antiqua" w:hAnsi="Book Antiqua"/>
-          <w:sz w:val="22"/>
-          <w:szCs w:val="22"/>
-        </w:rPr>
-        <w:t>Label update on scenario where within FIN001 1) the employee does not have a record of having any in-scope plan -or- 2) there is no missed paycheck dates identified. The label for scenario 1 is “</w:t>
+        <w:t xml:space="preserve"> Label update on scenario where within FIN001 1) the employee does not have a record of having any in-scope plan -or- 2) there is no missed paycheck dates identified. The label for scenario 1 is “</w:t>
       </w:r>
       <w:r>
         <w:rPr>
@@ -17720,7 +17768,7 @@
         </w:rPr>
         <w:lastRenderedPageBreak/>
         <w:drawing>
-          <wp:inline distT="0" distB="0" distL="0" distR="0" wp14:anchorId="24FC2444" wp14:editId="67161732">
+          <wp:inline distT="0" distB="0" distL="0" distR="0" wp14:anchorId="24FC2444" wp14:editId="7DA9CDDD">
             <wp:extent cx="4796287" cy="5943600"/>
             <wp:effectExtent l="152400" t="57150" r="328295" b="361950"/>
             <wp:docPr id="1357553133" name="drawing"/>
@@ -18259,7 +18307,7 @@
           <w:szCs w:val="22"/>
         </w:rPr>
         <w:drawing>
-          <wp:inline distT="0" distB="0" distL="0" distR="0" wp14:anchorId="576911D7" wp14:editId="2C9B90FD">
+          <wp:inline distT="0" distB="0" distL="0" distR="0" wp14:anchorId="576911D7" wp14:editId="24FC49D9">
             <wp:extent cx="5943600" cy="4592955"/>
             <wp:effectExtent l="0" t="0" r="0" b="0"/>
             <wp:docPr id="1354328155" name="Picture 1" descr="A screenshot of a computer&#10;&#10;AI-generated content may be incorrect."/>
@@ -21114,23 +21162,7 @@
                 <w:sz w:val="20"/>
                 <w:szCs w:val="20"/>
               </w:rPr>
-              <w:t>Line 16</w:t>
-            </w:r>
-            <w:r>
-              <w:rPr>
-                <w:rFonts w:ascii="Book Antiqua" w:hAnsi="Book Antiqua"/>
-                <w:sz w:val="20"/>
-                <w:szCs w:val="20"/>
-              </w:rPr>
-              <w:t xml:space="preserve"> - </w:t>
-            </w:r>
-            <w:r>
-              <w:rPr>
-                <w:rFonts w:ascii="Book Antiqua" w:hAnsi="Book Antiqua"/>
-                <w:sz w:val="20"/>
-                <w:szCs w:val="20"/>
-              </w:rPr>
-              <w:t>remove “string $rTableRow2[</w:t>
+              <w:t>Line 16 - remove “string $rTableRow2[</w:t>
             </w:r>
             <w:proofErr w:type="gramStart"/>
             <w:r>
@@ -21148,23 +21180,7 @@
                 <w:sz w:val="20"/>
                 <w:szCs w:val="20"/>
               </w:rPr>
-              <w:t xml:space="preserve"> Not Equal to Active”</w:t>
-            </w:r>
-            <w:r>
-              <w:rPr>
-                <w:rFonts w:ascii="Book Antiqua" w:hAnsi="Book Antiqua"/>
-                <w:sz w:val="20"/>
-                <w:szCs w:val="20"/>
-              </w:rPr>
-              <w:t xml:space="preserve"> o</w:t>
-            </w:r>
-            <w:r>
-              <w:rPr>
-                <w:rFonts w:ascii="Book Antiqua" w:hAnsi="Book Antiqua"/>
-                <w:sz w:val="20"/>
-                <w:szCs w:val="20"/>
-              </w:rPr>
-              <w:t>n IF statement</w:t>
+              <w:t xml:space="preserve"> Not Equal to Active” on IF statement</w:t>
             </w:r>
           </w:p>
         </w:tc>
@@ -22588,6 +22604,334 @@
                 <w:szCs w:val="20"/>
               </w:rPr>
               <w:t xml:space="preserve"> is to clear browser cache during the run</w:t>
+            </w:r>
+          </w:p>
+        </w:tc>
+      </w:tr>
+      <w:tr>
+        <w:tc>
+          <w:tcPr>
+            <w:tcW w:w="625" w:type="dxa"/>
+          </w:tcPr>
+          <w:p>
+            <w:pPr>
+              <w:pStyle w:val="Header"/>
+              <w:rPr>
+                <w:rFonts w:ascii="Book Antiqua" w:hAnsi="Book Antiqua"/>
+                <w:sz w:val="20"/>
+                <w:szCs w:val="20"/>
+              </w:rPr>
+            </w:pPr>
+            <w:r>
+              <w:rPr>
+                <w:rStyle w:val="normaltextrun"/>
+                <w:rFonts w:ascii="Book Antiqua" w:hAnsi="Book Antiqua" w:cs="Segoe UI"/>
+                <w:sz w:val="20"/>
+                <w:szCs w:val="20"/>
+              </w:rPr>
+              <w:t>5.0</w:t>
+            </w:r>
+            <w:r>
+              <w:rPr>
+                <w:rStyle w:val="eop"/>
+                <w:rFonts w:ascii="Book Antiqua" w:hAnsi="Book Antiqua" w:cs="Segoe UI"/>
+                <w:sz w:val="20"/>
+                <w:szCs w:val="20"/>
+              </w:rPr>
+              <w:t> </w:t>
+            </w:r>
+          </w:p>
+        </w:tc>
+        <w:tc>
+          <w:tcPr>
+            <w:tcW w:w="1735" w:type="dxa"/>
+          </w:tcPr>
+          <w:p>
+            <w:pPr>
+              <w:pStyle w:val="Header"/>
+              <w:rPr>
+                <w:rFonts w:ascii="Book Antiqua" w:hAnsi="Book Antiqua"/>
+                <w:sz w:val="20"/>
+                <w:szCs w:val="20"/>
+              </w:rPr>
+            </w:pPr>
+            <w:r>
+              <w:rPr>
+                <w:rStyle w:val="normaltextrun"/>
+                <w:rFonts w:ascii="Book Antiqua" w:hAnsi="Book Antiqua" w:cs="Segoe UI"/>
+                <w:sz w:val="20"/>
+                <w:szCs w:val="20"/>
+              </w:rPr>
+              <w:t>RFL-0-1-File Check</w:t>
+            </w:r>
+            <w:r>
+              <w:rPr>
+                <w:rStyle w:val="eop"/>
+                <w:rFonts w:ascii="Book Antiqua" w:hAnsi="Book Antiqua" w:cs="Segoe UI"/>
+                <w:sz w:val="20"/>
+                <w:szCs w:val="20"/>
+              </w:rPr>
+              <w:t> </w:t>
+            </w:r>
+          </w:p>
+        </w:tc>
+        <w:tc>
+          <w:tcPr>
+            <w:tcW w:w="4179" w:type="dxa"/>
+          </w:tcPr>
+          <w:p>
+            <w:pPr>
+              <w:pStyle w:val="Header"/>
+              <w:rPr>
+                <w:rFonts w:ascii="Book Antiqua" w:hAnsi="Book Antiqua"/>
+                <w:sz w:val="20"/>
+                <w:szCs w:val="20"/>
+              </w:rPr>
+            </w:pPr>
+            <w:r>
+              <w:rPr>
+                <w:rStyle w:val="normaltextrun"/>
+                <w:rFonts w:ascii="Book Antiqua" w:hAnsi="Book Antiqua" w:cs="Segoe UI"/>
+                <w:sz w:val="20"/>
+                <w:szCs w:val="20"/>
+              </w:rPr>
+              <w:t>Task bot was created on 4/21/2026</w:t>
+            </w:r>
+            <w:r>
+              <w:rPr>
+                <w:rStyle w:val="eop"/>
+                <w:rFonts w:ascii="Book Antiqua" w:hAnsi="Book Antiqua" w:cs="Segoe UI"/>
+                <w:sz w:val="20"/>
+                <w:szCs w:val="20"/>
+              </w:rPr>
+              <w:t> </w:t>
+            </w:r>
+          </w:p>
+        </w:tc>
+        <w:tc>
+          <w:tcPr>
+            <w:tcW w:w="2631" w:type="dxa"/>
+          </w:tcPr>
+          <w:p>
+            <w:pPr>
+              <w:pStyle w:val="Header"/>
+              <w:rPr>
+                <w:rFonts w:ascii="Book Antiqua" w:hAnsi="Book Antiqua"/>
+                <w:sz w:val="20"/>
+                <w:szCs w:val="20"/>
+              </w:rPr>
+            </w:pPr>
+            <w:r>
+              <w:rPr>
+                <w:rStyle w:val="normaltextrun"/>
+                <w:rFonts w:ascii="Book Antiqua" w:hAnsi="Book Antiqua" w:cs="Segoe UI"/>
+                <w:sz w:val="20"/>
+                <w:szCs w:val="20"/>
+              </w:rPr>
+              <w:t>This task </w:t>
+            </w:r>
+            <w:proofErr w:type="gramStart"/>
+            <w:r>
+              <w:rPr>
+                <w:rStyle w:val="normaltextrun"/>
+                <w:rFonts w:ascii="Book Antiqua" w:hAnsi="Book Antiqua" w:cs="Segoe UI"/>
+                <w:sz w:val="20"/>
+                <w:szCs w:val="20"/>
+              </w:rPr>
+              <w:t>bot</w:t>
+            </w:r>
+            <w:proofErr w:type="gramEnd"/>
+            <w:r>
+              <w:rPr>
+                <w:rStyle w:val="normaltextrun"/>
+                <w:rFonts w:ascii="Book Antiqua" w:hAnsi="Book Antiqua" w:cs="Segoe UI"/>
+                <w:sz w:val="20"/>
+                <w:szCs w:val="20"/>
+              </w:rPr>
+              <w:t> checks for a file under #UCPC-RPA &gt; Prod &gt; RFL &gt; Prod File Drop folder in Box. If a file is found, task bot </w:t>
+            </w:r>
+            <w:proofErr w:type="spellStart"/>
+            <w:r>
+              <w:rPr>
+                <w:rStyle w:val="normaltextrun"/>
+                <w:rFonts w:ascii="Book Antiqua" w:hAnsi="Book Antiqua" w:cs="Segoe UI"/>
+                <w:sz w:val="20"/>
+                <w:szCs w:val="20"/>
+              </w:rPr>
+              <w:t>ReturnFromLeaveReconciliation</w:t>
+            </w:r>
+            <w:proofErr w:type="spellEnd"/>
+            <w:r>
+              <w:rPr>
+                <w:rStyle w:val="normaltextrun"/>
+                <w:rFonts w:ascii="Book Antiqua" w:hAnsi="Book Antiqua" w:cs="Segoe UI"/>
+                <w:sz w:val="20"/>
+                <w:szCs w:val="20"/>
+              </w:rPr>
+              <w:t> is invoked.</w:t>
+            </w:r>
+            <w:r>
+              <w:rPr>
+                <w:rStyle w:val="eop"/>
+                <w:rFonts w:ascii="Book Antiqua" w:hAnsi="Book Antiqua" w:cs="Segoe UI"/>
+                <w:sz w:val="20"/>
+                <w:szCs w:val="20"/>
+              </w:rPr>
+              <w:t> </w:t>
+            </w:r>
+          </w:p>
+        </w:tc>
+      </w:tr>
+      <w:tr>
+        <w:tc>
+          <w:tcPr>
+            <w:tcW w:w="625" w:type="dxa"/>
+          </w:tcPr>
+          <w:p>
+            <w:pPr>
+              <w:pStyle w:val="Header"/>
+              <w:rPr>
+                <w:rFonts w:ascii="Book Antiqua" w:hAnsi="Book Antiqua"/>
+                <w:sz w:val="20"/>
+                <w:szCs w:val="20"/>
+              </w:rPr>
+            </w:pPr>
+            <w:r>
+              <w:rPr>
+                <w:rStyle w:val="normaltextrun"/>
+                <w:rFonts w:ascii="Book Antiqua" w:hAnsi="Book Antiqua" w:cs="Segoe UI"/>
+                <w:sz w:val="20"/>
+                <w:szCs w:val="20"/>
+              </w:rPr>
+              <w:t>6.0</w:t>
+            </w:r>
+            <w:r>
+              <w:rPr>
+                <w:rStyle w:val="eop"/>
+                <w:rFonts w:ascii="Book Antiqua" w:hAnsi="Book Antiqua" w:cs="Segoe UI"/>
+                <w:sz w:val="20"/>
+                <w:szCs w:val="20"/>
+              </w:rPr>
+              <w:t> </w:t>
+            </w:r>
+          </w:p>
+        </w:tc>
+        <w:tc>
+          <w:tcPr>
+            <w:tcW w:w="1735" w:type="dxa"/>
+          </w:tcPr>
+          <w:p>
+            <w:pPr>
+              <w:pStyle w:val="Header"/>
+              <w:rPr>
+                <w:rFonts w:ascii="Book Antiqua" w:hAnsi="Book Antiqua"/>
+                <w:sz w:val="20"/>
+                <w:szCs w:val="20"/>
+              </w:rPr>
+            </w:pPr>
+            <w:r>
+              <w:rPr>
+                <w:rStyle w:val="normaltextrun"/>
+                <w:rFonts w:ascii="Book Antiqua" w:hAnsi="Book Antiqua" w:cs="Segoe UI"/>
+                <w:sz w:val="20"/>
+                <w:szCs w:val="20"/>
+              </w:rPr>
+              <w:t>Scheduled job</w:t>
+            </w:r>
+            <w:r>
+              <w:rPr>
+                <w:rStyle w:val="eop"/>
+                <w:rFonts w:ascii="Book Antiqua" w:hAnsi="Book Antiqua" w:cs="Segoe UI"/>
+                <w:sz w:val="20"/>
+                <w:szCs w:val="20"/>
+              </w:rPr>
+              <w:t> </w:t>
+            </w:r>
+          </w:p>
+        </w:tc>
+        <w:tc>
+          <w:tcPr>
+            <w:tcW w:w="4179" w:type="dxa"/>
+          </w:tcPr>
+          <w:p>
+            <w:pPr>
+              <w:pStyle w:val="Header"/>
+              <w:rPr>
+                <w:rFonts w:ascii="Book Antiqua" w:hAnsi="Book Antiqua"/>
+                <w:sz w:val="20"/>
+                <w:szCs w:val="20"/>
+              </w:rPr>
+            </w:pPr>
+            <w:r>
+              <w:rPr>
+                <w:rStyle w:val="normaltextrun"/>
+                <w:rFonts w:ascii="Book Antiqua" w:hAnsi="Book Antiqua" w:cs="Segoe UI"/>
+                <w:sz w:val="20"/>
+                <w:szCs w:val="20"/>
+              </w:rPr>
+              <w:t>Scheduled job is updated where the job is run at 15 minutes interval starting from 8 am to 5 pm PT daily.</w:t>
+            </w:r>
+            <w:r>
+              <w:rPr>
+                <w:rStyle w:val="eop"/>
+                <w:rFonts w:ascii="Book Antiqua" w:hAnsi="Book Antiqua" w:cs="Segoe UI"/>
+                <w:sz w:val="20"/>
+                <w:szCs w:val="20"/>
+              </w:rPr>
+              <w:t> </w:t>
+            </w:r>
+          </w:p>
+        </w:tc>
+        <w:tc>
+          <w:tcPr>
+            <w:tcW w:w="2631" w:type="dxa"/>
+          </w:tcPr>
+          <w:p>
+            <w:pPr>
+              <w:pStyle w:val="Header"/>
+              <w:rPr>
+                <w:rFonts w:ascii="Book Antiqua" w:hAnsi="Book Antiqua"/>
+                <w:sz w:val="20"/>
+                <w:szCs w:val="20"/>
+              </w:rPr>
+            </w:pPr>
+            <w:r>
+              <w:rPr>
+                <w:rStyle w:val="normaltextrun"/>
+                <w:rFonts w:ascii="Book Antiqua" w:hAnsi="Book Antiqua" w:cs="Segoe UI"/>
+                <w:sz w:val="20"/>
+                <w:szCs w:val="20"/>
+              </w:rPr>
+              <w:t xml:space="preserve">Job executes RFL-0-1-File Check </w:t>
+            </w:r>
+            <w:proofErr w:type="gramStart"/>
+            <w:r>
+              <w:rPr>
+                <w:rStyle w:val="normaltextrun"/>
+                <w:rFonts w:ascii="Book Antiqua" w:hAnsi="Book Antiqua" w:cs="Segoe UI"/>
+                <w:sz w:val="20"/>
+                <w:szCs w:val="20"/>
+              </w:rPr>
+              <w:t>task bot</w:t>
+            </w:r>
+            <w:proofErr w:type="gramEnd"/>
+            <w:r>
+              <w:rPr>
+                <w:rStyle w:val="normaltextrun"/>
+                <w:rFonts w:ascii="Book Antiqua" w:hAnsi="Book Antiqua" w:cs="Segoe UI"/>
+                <w:sz w:val="20"/>
+                <w:szCs w:val="20"/>
+              </w:rPr>
+              <w:t xml:space="preserve"> in 15 minutes interval.</w:t>
+            </w:r>
+            <w:r>
+              <w:rPr>
+                <w:rStyle w:val="eop"/>
+                <w:rFonts w:ascii="Book Antiqua" w:hAnsi="Book Antiqua" w:cs="Segoe UI"/>
+                <w:sz w:val="20"/>
+                <w:szCs w:val="20"/>
+              </w:rPr>
+              <w:t> </w:t>
             </w:r>
           </w:p>
         </w:tc>
@@ -30759,6 +31103,7 @@
   <w:style w:type="character" w:default="1" w:styleId="DefaultParagraphFont">
     <w:name w:val="Default Paragraph Font"/>
     <w:uiPriority w:val="1"/>
+    <w:semiHidden/>
     <w:unhideWhenUsed/>
   </w:style>
   <w:style w:type="table" w:default="1" w:styleId="TableNormal">
@@ -32334,22 +32679,20 @@
 </file>
 
 <file path=customXml/item1.xml><?xml version="1.0" encoding="utf-8"?>
-<b:Sources xmlns:b="http://schemas.openxmlformats.org/officeDocument/2006/bibliography" xmlns="http://schemas.openxmlformats.org/officeDocument/2006/bibliography" SelectedStyle="\APA.XSL" StyleName="APA"/>
+<LongProperties xmlns="http://schemas.microsoft.com/office/2006/metadata/longProperties"/>
 </file>
 
 <file path=customXml/item2.xml><?xml version="1.0" encoding="utf-8"?>
-<p:properties xmlns:p="http://schemas.microsoft.com/office/2006/metadata/properties" xmlns:xsi="http://www.w3.org/2001/XMLSchema-instance" xmlns:pc="http://schemas.microsoft.com/office/infopath/2007/PartnerControls">
-  <documentManagement/>
-</p:properties>
-</file>
-
-<file path=customXml/item3.xml><?xml version="1.0" encoding="utf-8"?>
 <?mso-contentType ?>
 <FormTemplates xmlns="http://schemas.microsoft.com/sharepoint/v3/contenttype/forms">
   <Display>DocumentLibraryForm</Display>
   <Edit>DocumentLibraryForm</Edit>
   <New>DocumentLibraryForm</New>
 </FormTemplates>
+</file>
+
+<file path=customXml/item3.xml><?xml version="1.0" encoding="utf-8"?>
+<b:Sources xmlns:b="http://schemas.openxmlformats.org/officeDocument/2006/bibliography" xmlns="http://schemas.openxmlformats.org/officeDocument/2006/bibliography" SelectedStyle="\APA.XSL" StyleName="APA"/>
 </file>
 
 <file path=customXml/item4.xml><?xml version="1.0" encoding="utf-8"?>
@@ -32467,30 +32810,31 @@
 </file>
 
 <file path=customXml/item5.xml><?xml version="1.0" encoding="utf-8"?>
-<LongProperties xmlns="http://schemas.microsoft.com/office/2006/metadata/longProperties"/>
+<p:properties xmlns:p="http://schemas.microsoft.com/office/2006/metadata/properties" xmlns:xsi="http://www.w3.org/2001/XMLSchema-instance" xmlns:pc="http://schemas.microsoft.com/office/infopath/2007/PartnerControls">
+  <documentManagement/>
+</p:properties>
 </file>
 
 <file path=customXml/itemProps1.xml><?xml version="1.0" encoding="utf-8"?>
-<ds:datastoreItem xmlns:ds="http://schemas.openxmlformats.org/officeDocument/2006/customXml" ds:itemID="{3296601E-7D3D-428A-BD50-D4D9F9C36C1E}">
+<ds:datastoreItem xmlns:ds="http://schemas.openxmlformats.org/officeDocument/2006/customXml" ds:itemID="{D0D3ECD8-8E6B-4E5D-862B-ACE028DC26FC}">
   <ds:schemaRefs>
-    <ds:schemaRef ds:uri="http://schemas.openxmlformats.org/officeDocument/2006/bibliography"/>
+    <ds:schemaRef ds:uri="http://schemas.microsoft.com/office/2006/metadata/longProperties"/>
   </ds:schemaRefs>
 </ds:datastoreItem>
 </file>
 
 <file path=customXml/itemProps2.xml><?xml version="1.0" encoding="utf-8"?>
-<ds:datastoreItem xmlns:ds="http://schemas.openxmlformats.org/officeDocument/2006/customXml" ds:itemID="{3BF725BA-15F8-4AF3-8798-1484D59226E6}">
+<ds:datastoreItem xmlns:ds="http://schemas.openxmlformats.org/officeDocument/2006/customXml" ds:itemID="{4CEEB78E-8C98-46F5-8877-965A33B66571}">
   <ds:schemaRefs>
-    <ds:schemaRef ds:uri="http://schemas.microsoft.com/office/2006/metadata/properties"/>
-    <ds:schemaRef ds:uri="http://schemas.microsoft.com/office/infopath/2007/PartnerControls"/>
+    <ds:schemaRef ds:uri="http://schemas.microsoft.com/sharepoint/v3/contenttype/forms"/>
   </ds:schemaRefs>
 </ds:datastoreItem>
 </file>
 
 <file path=customXml/itemProps3.xml><?xml version="1.0" encoding="utf-8"?>
-<ds:datastoreItem xmlns:ds="http://schemas.openxmlformats.org/officeDocument/2006/customXml" ds:itemID="{4CEEB78E-8C98-46F5-8877-965A33B66571}">
+<ds:datastoreItem xmlns:ds="http://schemas.openxmlformats.org/officeDocument/2006/customXml" ds:itemID="{3296601E-7D3D-428A-BD50-D4D9F9C36C1E}">
   <ds:schemaRefs>
-    <ds:schemaRef ds:uri="http://schemas.microsoft.com/sharepoint/v3/contenttype/forms"/>
+    <ds:schemaRef ds:uri="http://schemas.openxmlformats.org/officeDocument/2006/bibliography"/>
   </ds:schemaRefs>
 </ds:datastoreItem>
 </file>
@@ -32512,9 +32856,10 @@
 </file>
 
 <file path=customXml/itemProps5.xml><?xml version="1.0" encoding="utf-8"?>
-<ds:datastoreItem xmlns:ds="http://schemas.openxmlformats.org/officeDocument/2006/customXml" ds:itemID="{D0D3ECD8-8E6B-4E5D-862B-ACE028DC26FC}">
+<ds:datastoreItem xmlns:ds="http://schemas.openxmlformats.org/officeDocument/2006/customXml" ds:itemID="{3BF725BA-15F8-4AF3-8798-1484D59226E6}">
   <ds:schemaRefs>
-    <ds:schemaRef ds:uri="http://schemas.microsoft.com/office/2006/metadata/longProperties"/>
+    <ds:schemaRef ds:uri="http://schemas.microsoft.com/office/2006/metadata/properties"/>
+    <ds:schemaRef ds:uri="http://schemas.microsoft.com/office/infopath/2007/PartnerControls"/>
   </ds:schemaRefs>
 </ds:datastoreItem>
 </file>
</xml_diff>